<commit_message>
feat: Add zero character normalization in Chinese doc numbers and remove automatic suffixing of '函'
</commit_message>
<xml_diff>
--- a/第一章/第一章_排版後.docx
+++ b/第一章/第一章_排版後.docx
@@ -93,7 +93,7 @@
           <w:b w:val="0"/>
           <w:sz w:val="24"/>
         </w:rPr>
-        <w:t>說明：復貴局八十七年十月廿三日八十七林範字第三Ｏ九六號函。</w:t>
+        <w:t>說明：復貴局八十七年十月廿三日八十七林範字第三〇九六號函。</w:t>
       </w:r>
     </w:p>
     <w:p/>
@@ -246,7 +246,7 @@
           <w:b w:val="0"/>
           <w:sz w:val="24"/>
         </w:rPr>
-        <w:t>一、復貴局八十八年六月二十三日八十八職檢字第Ｏ一一七九五號函。</w:t>
+        <w:t>一、復貴局八十八年六月二十三日八十八職檢字第〇一一七九五號函。</w:t>
       </w:r>
     </w:p>
     <w:p>
@@ -473,7 +473,7 @@
           <w:b w:val="0"/>
           <w:sz w:val="24"/>
         </w:rPr>
-        <w:t>一、復貴局八十八年六月八日工(八八)五字第Ｏ二二八七八號函。</w:t>
+        <w:t>一、復貴局八十八年六月八日工(八八)五字第〇二二八七八號函。</w:t>
       </w:r>
     </w:p>
     <w:p>
@@ -579,7 +579,7 @@
           <w:b w:val="0"/>
           <w:sz w:val="24"/>
         </w:rPr>
-        <w:t>一、復貴局八十八年六月二十四日台八十八職公字第Ｏ一一一四七號函。</w:t>
+        <w:t>一、復貴局八十八年六月二十四日台八十八職公字第〇一一一四七號函。</w:t>
       </w:r>
     </w:p>
     <w:p>
@@ -823,7 +823,7 @@
           <w:b w:val="0"/>
           <w:sz w:val="24"/>
         </w:rPr>
-        <w:t>說明：復貴局八十八年八月十七日八八公財字第二一三四Ｏ號函。</w:t>
+        <w:t>說明：復貴局八十八年八月十七日八八公財字第二一三四〇號函。</w:t>
       </w:r>
     </w:p>
     <w:p/>
@@ -1172,7 +1172,7 @@
           <w:b w:val="0"/>
           <w:sz w:val="24"/>
         </w:rPr>
-        <w:t>一、復貴局八十九年一月五日(八九)童托字第八九０００六三號函。</w:t>
+        <w:t>一、復貴局八十九年一月五日(八九)童托字第八九〇〇〇六三號函。</w:t>
       </w:r>
     </w:p>
     <w:p>
@@ -1506,7 +1506,7 @@
           <w:b w:val="0"/>
           <w:sz w:val="24"/>
         </w:rPr>
-        <w:t>說明：復貴府八十九年五月五日八九彰府工發字第０八四五五九號函。</w:t>
+        <w:t>說明：復貴府八十九年五月五日八九彰府工發字第〇八四五五九號函。</w:t>
       </w:r>
     </w:p>
     <w:p>
@@ -1825,22 +1825,22 @@
           <w:b w:val="0"/>
           <w:sz w:val="24"/>
         </w:rPr>
-        <w:t>二、旨揭委託案係貴公司依都市計畫法第二十四條規定將土地利用之規劃及變更計畫之擬定作業委託辦理，因該擬定作業非都市計畫法所定新竹市政府之法定職權，應屬勞務委託，故委託對象之擇定，自應適用政府採購法。本會並已以八十九年十一月十日（八九）工程企字第八九０三二四六九號函復經濟部國營事業委員會在案。</w:t>
-      </w:r>
-    </w:p>
-    <w:p>
-      <w:pPr>
-        <w:pStyle w:val="a9"/>
-        <w:ind w:left="720" w:hanging="480"/>
-        <w:jc w:val="both"/>
-      </w:pPr>
-      <w:r>
-        <w:rPr>
-          <w:rFonts w:ascii="新細明體" w:hAnsi="新細明體" w:eastAsia="新細明體"/>
-          <w:b w:val="0"/>
-          <w:sz w:val="24"/>
-        </w:rPr>
-        <w:t>三、本會八十八年七月二十日（八八）工程企字第八八０八五二三號函（答覆臺灣鐵路管理局函）自即日起停止適用。</w:t>
+        <w:t>二、旨揭委託案係貴公司依都市計畫法第二十四條規定將土地利用之規劃及變更計畫之擬定作業委託辦理，因該擬定作業非都市計畫法所定新竹市政府之法定職權，應屬勞務委託，故委託對象之擇定，自應適用政府採購法。本會並已以八十九年十一月十日（八九）工程企字第八九〇三二四六九號函復經濟部國營事業委員會在案。</w:t>
+      </w:r>
+    </w:p>
+    <w:p>
+      <w:pPr>
+        <w:pStyle w:val="a9"/>
+        <w:ind w:left="720" w:hanging="480"/>
+        <w:jc w:val="both"/>
+      </w:pPr>
+      <w:r>
+        <w:rPr>
+          <w:rFonts w:ascii="新細明體" w:hAnsi="新細明體" w:eastAsia="新細明體"/>
+          <w:b w:val="0"/>
+          <w:sz w:val="24"/>
+        </w:rPr>
+        <w:t>三、本會八十八年七月二十日（八八）工程企字第八八〇八五二三號函（答覆臺灣鐵路管理局函）自即日起停止適用。</w:t>
       </w:r>
     </w:p>
     <w:p/>
@@ -3808,7 +3808,22 @@
           <w:b w:val="0"/>
           <w:sz w:val="24"/>
         </w:rPr>
-        <w:t>一、依GPA委員會1996年3月5日GPA第1號決議附件三（GPA/1 Annex 3），GPA締約國需換算其開放清單附錄1之門檻金額為該國貨幣，並通知GPA委員會，該門檻金額自新年度1月1日起維持固定兩年不變。二、我國本次換算金額效期自2011年1月1日起至2012年12月31日止。</w:t>
+        <w:t>一、依GPA委員會1996年3月5日GPA第1號決議附件三（GPA/1 Annex 3），GPA締約國需換算其開放清單附錄1之門檻金額為該國貨幣，並通知GPA委員會，該門檻金額自新年度1月1日起維持固定兩年不變。</w:t>
+      </w:r>
+    </w:p>
+    <w:p>
+      <w:pPr>
+        <w:pStyle w:val="a9"/>
+        <w:ind w:left="720" w:hanging="480"/>
+        <w:jc w:val="both"/>
+      </w:pPr>
+      <w:r>
+        <w:rPr>
+          <w:rFonts w:ascii="新細明體" w:hAnsi="新細明體" w:eastAsia="新細明體"/>
+          <w:b w:val="0"/>
+          <w:sz w:val="24"/>
+        </w:rPr>
+        <w:t>二、我國本次換算金額效期自2011年1月1日起至2012年12月31日止。</w:t>
       </w:r>
     </w:p>
     <w:p/>
@@ -4920,8 +4935,21 @@
           <w:sz w:val="24"/>
         </w:rPr>
         <w:t>主旨：臺紐經濟合作協定(ANZTEC)政府採購章門檻金額2019年至2020年換算結果如說明，請查照並轉知所屬適用機關。</w:t>
-        <w:br/>
-        <w:t>說明：ANZTEC政府採購章以特別提款權(SDR)為單位之門檻金額，換算新臺幣如附件，其適用期自民國108年1月1日起至109年12月31日止。</w:t>
+      </w:r>
+    </w:p>
+    <w:p>
+      <w:pPr>
+        <w:pStyle w:val="a9"/>
+        <w:ind w:left="720" w:hanging="720"/>
+        <w:jc w:val="both"/>
+      </w:pPr>
+      <w:r>
+        <w:rPr>
+          <w:rFonts w:ascii="新細明體" w:hAnsi="新細明體" w:eastAsia="新細明體"/>
+          <w:b w:val="0"/>
+          <w:sz w:val="24"/>
+        </w:rPr>
+        <w:t>說明：ANZTEC政府採購章以特別提款權(SDR)為單位之門檻金額，換算新臺幣如附件，其適用期自民國108年1月1日起至109年12月31日止。</w:t>
       </w:r>
     </w:p>
     <w:p/>
@@ -6356,7 +6384,7 @@
           <w:b w:val="0"/>
           <w:sz w:val="24"/>
         </w:rPr>
-        <w:t>說明：復貴局八十八年八月三日北市環總字第八八二二八九三九ＯＯ號函。</w:t>
+        <w:t>說明：復貴局八十八年八月三日北市環總字第八八二二八九三九〇〇號函。</w:t>
       </w:r>
     </w:p>
     <w:p/>
@@ -6463,22 +6491,22 @@
           <w:b w:val="0"/>
           <w:sz w:val="24"/>
         </w:rPr>
-        <w:t>一、復貴會八十八年八月十七日﹙八八﹚農企字第八八Ｏ一Ｏ二二四號函。</w:t>
-      </w:r>
-    </w:p>
-    <w:p>
-      <w:pPr>
-        <w:pStyle w:val="a9"/>
-        <w:ind w:left="720" w:hanging="480"/>
-        <w:jc w:val="both"/>
-      </w:pPr>
-      <w:r>
-        <w:rPr>
-          <w:rFonts w:ascii="新細明體" w:hAnsi="新細明體" w:eastAsia="新細明體"/>
-          <w:b w:val="0"/>
-          <w:sz w:val="24"/>
-        </w:rPr>
-        <w:t>二、依「台灣省政府功能業務與組織調整暫行條例」第二條規定，台灣省政府﹙以下簡稱省政府﹚為行政院派出機關辦理行政院交辦事項。行政院八十八年七月八日台八十七研綜字第Ｏ三四Ｏ九號函所列中央委託省政府辦理事項，應屬行政院交辦事項，首揭計畫如屬上揭院函所列事項，貴會得逕行委託省政府辦理，不適用政府採購法。</w:t>
+        <w:t>一、復貴會八十八年八月十七日﹙八八﹚農企字第八八〇一〇二二四號函。</w:t>
+      </w:r>
+    </w:p>
+    <w:p>
+      <w:pPr>
+        <w:pStyle w:val="a9"/>
+        <w:ind w:left="720" w:hanging="480"/>
+        <w:jc w:val="both"/>
+      </w:pPr>
+      <w:r>
+        <w:rPr>
+          <w:rFonts w:ascii="新細明體" w:hAnsi="新細明體" w:eastAsia="新細明體"/>
+          <w:b w:val="0"/>
+          <w:sz w:val="24"/>
+        </w:rPr>
+        <w:t>二、依「台灣省政府功能業務與組織調整暫行條例」第二條規定，台灣省政府﹙以下簡稱省政府﹚為行政院派出機關辦理行政院交辦事項。行政院八十八年七月八日台八十七研綜字第〇三四〇九號函所列中央委託省政府辦理事項，應屬行政院交辦事項，首揭計畫如屬上揭院函所列事項，貴會得逕行委託省政府辦理，不適用政府採購法。</w:t>
       </w:r>
     </w:p>
     <w:p/>
@@ -6539,7 +6567,7 @@
           <w:b w:val="0"/>
           <w:sz w:val="24"/>
         </w:rPr>
-        <w:t>一、復貴局八十八年六月二日八十八職檢字第Ｏ一Ｏ二六四號暨七月十四日八十八職檢字第Ｏ一三八Ｏ七號二函。</w:t>
+        <w:t>一、復貴局八十八年六月二日八十八職檢字第〇一〇二六四號暨七月十四日八十八職檢字第〇一三八〇七號二函。</w:t>
       </w:r>
     </w:p>
     <w:p>
@@ -6600,7 +6628,7 @@
           <w:b w:val="0"/>
           <w:sz w:val="24"/>
         </w:rPr>
-        <w:t>說明：復貴公司八十八年九月十五日北捷捷財字第八八二一四二一八ＯＯ號函。</w:t>
+        <w:t>說明：復貴公司八十八年九月十五日北捷捷財字第八八二一四二一八〇〇號函。</w:t>
       </w:r>
     </w:p>
     <w:p/>
@@ -6936,7 +6964,7 @@
           <w:b/>
           <w:sz w:val="24"/>
         </w:rPr>
-        <w:t>行政院公共工程委員會95年07月05日工程企字第09500243340號令函</w:t>
+        <w:t>行政院公共工程委員會95年07月05日工程企字第09500243340號令</w:t>
       </w:r>
     </w:p>
     <w:p>
@@ -8559,7 +8587,7 @@
           <w:b w:val="0"/>
           <w:sz w:val="24"/>
         </w:rPr>
-        <w:t>說明：復貴局八十八年六月二十四日貿（八八）二發字第Ｏ七三三一號函。</w:t>
+        <w:t>說明：復貴局八十八年六月二十四日貿（八八）二發字第〇七三三一號函。</w:t>
       </w:r>
     </w:p>
     <w:p/>
@@ -8773,7 +8801,7 @@
           <w:b w:val="0"/>
           <w:sz w:val="24"/>
         </w:rPr>
-        <w:t>說明：復貴局八十八年八月十八日北市捷五字第八八二一九Ｏ四六ＯＯ號函。</w:t>
+        <w:t>說明：復貴局八十八年八月十八日北市捷五字第八八二一九〇四六〇〇號函。</w:t>
       </w:r>
     </w:p>
     <w:p/>
@@ -8880,7 +8908,7 @@
           <w:b w:val="0"/>
           <w:sz w:val="24"/>
         </w:rPr>
-        <w:t>一、復貴部八十八年九月三日交航八十八字第Ｏ四Ｏ七Ｏ二號函。</w:t>
+        <w:t>一、復貴部八十八年九月三日交航八十八字第〇四〇七〇二號函。</w:t>
       </w:r>
     </w:p>
     <w:p>
@@ -8941,7 +8969,7 @@
           <w:b w:val="0"/>
           <w:sz w:val="24"/>
         </w:rPr>
-        <w:t>說明：本會八十八年六月二十八日（八八）工程企字第八八〇八六八一號函及八十八年七月二十七日（八八）工程企字第八八一〇八一Ｏ號函停止適用，八十八年七月七日（八八）工程企字第八八〇九二Ｏ八號函及八十八年七月二十日（八八）工程企字第八八〇八四七三號函與首揭意旨不合部分，停止適用。</w:t>
+        <w:t>說明：本會八十八年六月二十八日（八八）工程企字第八八〇八六八一號函及八十八年七月二十七日（八八）工程企字第八八一〇八一〇號函停止適用，八十八年七月七日（八八）工程企字第八八〇九二〇八號函及八十八年七月二十日（八八）工程企字第八八〇八四七三號函與首揭意旨不合部分，停止適用。</w:t>
       </w:r>
     </w:p>
     <w:p/>
@@ -9033,7 +9061,7 @@
           <w:b w:val="0"/>
           <w:sz w:val="24"/>
         </w:rPr>
-        <w:t>說明：本會八十八年八月三十一日 (八八)工程企字第八八一〇六三四號函答復貴部八十八年七月十六日台(八八)內社字第八八二五七九Ｏ號函及高雄市政府社會局八十八年七月二日高市社局秘字第一九Ｏ二六號所提「高雄市政府社會局暨所屬各機關對政府採購法意見彙整表」項次四、五、七、九、十等五項建議，諒達；另項次一、二、三、六、八等五項，答復如附件。</w:t>
+        <w:t>說明：本會八十八年八月三十一日 (八八)工程企字第八八一〇六三四號函答復貴部八十八年七月十六日台(八八)內社字第八八二五七九〇號函及高雄市政府社會局八十八年七月二日高市社局秘字第一九〇二六號所提「高雄市政府社會局暨所屬各機關對政府採購法意見彙整表」項次四、五、七、九、十等五項建議，諒達；另項次一、二、三、六、八等五項，答復如附件。</w:t>
       </w:r>
     </w:p>
     <w:p>
@@ -9354,7 +9382,7 @@
           <w:b w:val="0"/>
           <w:sz w:val="24"/>
         </w:rPr>
-        <w:t>一、復貴會八十九年六月二十六日八十九僑法字第０三二三七五號函。</w:t>
+        <w:t>一、復貴會八十九年六月二十六日八十九僑法字第〇三二三七五號函。</w:t>
       </w:r>
     </w:p>
     <w:p>
@@ -9446,7 +9474,7 @@
           <w:b/>
           <w:sz w:val="24"/>
         </w:rPr>
-        <w:t>行政院公共工程委員會90年07月06日(90)工程企字第90023318號令函</w:t>
+        <w:t>行政院公共工程委員會90年07月06日(90)工程企字第90023318號令</w:t>
       </w:r>
     </w:p>
     <w:p>
@@ -10932,7 +10960,7 @@
           <w:b w:val="0"/>
           <w:sz w:val="24"/>
         </w:rPr>
-        <w:t>一、復貴會八十八年七月八日八八文建秘字第Ｏ五二Ｏ八號函。</w:t>
+        <w:t>一、復貴會八十八年七月八日八八文建秘字第〇五二〇八號函。</w:t>
       </w:r>
     </w:p>
     <w:p>
@@ -11053,7 +11081,7 @@
           <w:b w:val="0"/>
           <w:sz w:val="24"/>
         </w:rPr>
-        <w:t>一、復貴公司八十八年七月三日﹙八八﹚船財字第四Ｏ七四號函。</w:t>
+        <w:t>一、復貴公司八十八年七月三日﹙八八﹚船財字第四〇七四號函。</w:t>
       </w:r>
     </w:p>
     <w:p>
@@ -12250,7 +12278,7 @@
           <w:b w:val="0"/>
           <w:sz w:val="24"/>
         </w:rPr>
-        <w:t>一、復貴署八十八年八月二十五日﹙八八﹚漁一字第八八六七ＯＯ三九號函。</w:t>
+        <w:t>一、復貴署八十八年八月二十五日﹙八八﹚漁一字第八八六七〇〇三九號函。</w:t>
       </w:r>
     </w:p>
     <w:p>
@@ -12447,7 +12475,7 @@
           <w:b w:val="0"/>
           <w:sz w:val="24"/>
         </w:rPr>
-        <w:t>說明：復貴部八十八年九月四日台(八八)內社字第八八九三六三二號函及九月十六日台(八八)內社字第八八八五三五Ｏ號函。</w:t>
+        <w:t>說明：復貴部八十八年九月四日台(八八)內社字第八八九三六三二號函及九月十六日台(八八)內社字第八八八五三五〇號函。</w:t>
       </w:r>
     </w:p>
     <w:p>
@@ -13577,7 +13605,7 @@
           <w:b/>
           <w:sz w:val="24"/>
         </w:rPr>
-        <w:t>行政院公共工程委員會96年03月27日工程企字第09600115591號令函</w:t>
+        <w:t>行政院公共工程委員會96年03月27日工程企字第09600115591號令</w:t>
       </w:r>
     </w:p>
     <w:p>
@@ -15076,7 +15104,7 @@
           <w:b w:val="0"/>
           <w:sz w:val="24"/>
         </w:rPr>
-        <w:t>一、復貴公司八十八年五月二十五日(八八)和業字第００三二號函。</w:t>
+        <w:t>一、復貴公司八十八年五月二十五日(八八)和業字第〇〇三二號函。</w:t>
       </w:r>
     </w:p>
     <w:p>
@@ -16212,7 +16240,7 @@
           <w:b w:val="0"/>
           <w:sz w:val="24"/>
         </w:rPr>
-        <w:t>一、復貴府八十九年六月二十一日府工三字第八九０四九一二三００號函。</w:t>
+        <w:t>一、復貴府八十九年六月二十一日府工三字第八九〇四九一二三〇〇號函。</w:t>
       </w:r>
     </w:p>
     <w:p>
@@ -17133,7 +17161,7 @@
           <w:b w:val="0"/>
           <w:sz w:val="24"/>
         </w:rPr>
-        <w:t>一、復貴府八十八年六月十日(八八)投府社福字第Ｏ九Ｏ六三四號函。</w:t>
+        <w:t>一、復貴府八十八年六月十日(八八)投府社福字第〇九〇六三四號函。</w:t>
       </w:r>
     </w:p>
     <w:p>
@@ -18118,7 +18146,7 @@
           <w:b w:val="0"/>
           <w:sz w:val="24"/>
         </w:rPr>
-        <w:t>一、復貴部八十八年六月三日台(八八)總(二)字第八八Ｏ六二一九二號函。</w:t>
+        <w:t>一、復貴部八十八年六月三日台(八八)總(二)字第八八〇六二一九二號函。</w:t>
       </w:r>
     </w:p>
     <w:p>
@@ -18785,7 +18813,7 @@
           <w:b w:val="0"/>
           <w:sz w:val="24"/>
         </w:rPr>
-        <w:t>一、復貴會八十八年八月二日八十八僑一綜字第ＯＯ三九二六號函。</w:t>
+        <w:t>一、復貴會八十八年八月二日八十八僑一綜字第〇〇三九二六號函。</w:t>
       </w:r>
     </w:p>
     <w:p>
@@ -19496,7 +19524,7 @@
           <w:b w:val="0"/>
           <w:sz w:val="24"/>
         </w:rPr>
-        <w:t>一、復貴局八十八年九月二十八日北市都一字第八八二二一０七五００號函。</w:t>
+        <w:t>一、復貴局八十八年九月二十八日北市都一字第八八二二一〇七五〇〇號函。</w:t>
       </w:r>
     </w:p>
     <w:p>
@@ -20520,7 +20548,7 @@
           <w:b w:val="0"/>
           <w:sz w:val="24"/>
         </w:rPr>
-        <w:t>說明：復貴社八十八年九月廿九日基市大中合字第０八０七號函。</w:t>
+        <w:t>說明：復貴社八十八年九月廿九日基市大中合字第〇八〇七號函。</w:t>
       </w:r>
     </w:p>
     <w:p/>
@@ -21292,22 +21320,22 @@
           <w:b w:val="0"/>
           <w:sz w:val="24"/>
         </w:rPr>
-        <w:t>一、為提升機關採購效率及確保採購品質，並避免發生權責劃分不清等爭議，重申各機關辦理委託旨揭專案管理時，應依本會91年12月11日工程術字第09100539690號函頒&lt;a href="http://planpe.pcc.gov.tw/gpletf/095001182709102-1.doc" target="_blank"「公共工程履約權責劃分及管理應注意事項」附表一所示（如附件一）&lt;/a，將各階段所需參採資料、工作重點、工作成果及權責劃分，視個案工程規模、實際需要及既有資料等選擇或增、修列之，並訂明於契約中。</w:t>
-      </w:r>
-    </w:p>
-    <w:p>
-      <w:pPr>
-        <w:pStyle w:val="a9"/>
-        <w:ind w:left="720" w:hanging="480"/>
-        <w:jc w:val="both"/>
-      </w:pPr>
-      <w:r>
-        <w:rPr>
-          <w:rFonts w:ascii="新細明體" w:hAnsi="新細明體" w:eastAsia="新細明體"/>
-          <w:b w:val="0"/>
-          <w:sz w:val="24"/>
-        </w:rPr>
-        <w:t>二、另統包工程履約過程之相關作業，請參考本會訂頒&lt;a href="http://planpe.pcc.gov.tw/gpletf/095001182709102-2.doc" target="_blank"「統包模式之工程進度及品質管理參考手冊」（如附件二）&lt;/a辦理。</w:t>
+        <w:t>一、為提升機關採購效率及確保採購品質，並避免發生權責劃分不清等爭議，重申各機關辦理委託旨揭專案管理時，應依本會91年12月11日工程術字第09100539690號函頒&lt;a href="http://planpe.pcc.gov.tw/gpletf/095001182709102-1.doc" target="_blank"「公共工程履約權責劃分及管理應注意事項」附表一所示（如附件一）&lt;/a&gt;，將各階段所需參採資料、工作重點、工作成果及權責劃分，視個案工程規模、實際需要及既有資料等選擇或增、修列之，並訂明於契約中。</w:t>
+      </w:r>
+    </w:p>
+    <w:p>
+      <w:pPr>
+        <w:pStyle w:val="a9"/>
+        <w:ind w:left="720" w:hanging="480"/>
+        <w:jc w:val="both"/>
+      </w:pPr>
+      <w:r>
+        <w:rPr>
+          <w:rFonts w:ascii="新細明體" w:hAnsi="新細明體" w:eastAsia="新細明體"/>
+          <w:b w:val="0"/>
+          <w:sz w:val="24"/>
+        </w:rPr>
+        <w:t>二、另統包工程履約過程之相關作業，請參考本會訂頒&lt;a href="http://planpe.pcc.gov.tw/gpletf/095001182709102-2.doc" target="_blank"「統包模式之工程進度及品質管理參考手冊」（如附件二）&lt;/a&gt;辦理。</w:t>
       </w:r>
     </w:p>
     <w:p/>
@@ -22246,7 +22274,7 @@
           <w:b w:val="0"/>
           <w:sz w:val="24"/>
         </w:rPr>
-        <w:t>說明：復貴所八十八年八月二十三日八十八觀技北字第０００九四號函。</w:t>
+        <w:t>說明：復貴所八十八年八月二十三日八十八觀技北字第〇〇〇九四號函。</w:t>
       </w:r>
     </w:p>
     <w:p/>
@@ -22353,22 +22381,22 @@
           <w:b w:val="0"/>
           <w:sz w:val="24"/>
         </w:rPr>
-        <w:t>一、復貴府八十九年一月五日八九北府工養字第ＯＯ六五八六號函。</w:t>
-      </w:r>
-    </w:p>
-    <w:p>
-      <w:pPr>
-        <w:pStyle w:val="a9"/>
-        <w:ind w:left="720" w:hanging="480"/>
-        <w:jc w:val="both"/>
-      </w:pPr>
-      <w:r>
-        <w:rPr>
-          <w:rFonts w:ascii="新細明體" w:hAnsi="新細明體" w:eastAsia="新細明體"/>
-          <w:b w:val="0"/>
-          <w:sz w:val="24"/>
-        </w:rPr>
-        <w:t>二、機關依本法第四十條規定洽由其他具有專業能力之機關代辦採購，依本法第四十六條之規定，其底價應由洽辦機關之機關首長或其授權人員核定；並得依本法施行細則第四十二條第一項第五款「洽辦機關得行使之職權或應辦理之事項，得由代辦機關代為行使或辦理」之規定辦理。本會八十八年七月八日（八八）工程企字第八八Ｏ九四三二號函附件第五點答復內容並未限制上開施行細則條款之適用。</w:t>
+        <w:t>一、復貴府八十九年一月五日八九北府工養字第〇〇六五八六號函。</w:t>
+      </w:r>
+    </w:p>
+    <w:p>
+      <w:pPr>
+        <w:pStyle w:val="a9"/>
+        <w:ind w:left="720" w:hanging="480"/>
+        <w:jc w:val="both"/>
+      </w:pPr>
+      <w:r>
+        <w:rPr>
+          <w:rFonts w:ascii="新細明體" w:hAnsi="新細明體" w:eastAsia="新細明體"/>
+          <w:b w:val="0"/>
+          <w:sz w:val="24"/>
+        </w:rPr>
+        <w:t>二、機關依本法第四十條規定洽由其他具有專業能力之機關代辦採購，依本法第四十六條之規定，其底價應由洽辦機關之機關首長或其授權人員核定；並得依本法施行細則第四十二條第一項第五款「洽辦機關得行使之職權或應辦理之事項，得由代辦機關代為行使或辦理」之規定辦理。本會八十八年七月八日（八八）工程企字第八八〇九四三二號函附件第五點答復內容並未限制上開施行細則條款之適用。</w:t>
       </w:r>
     </w:p>
     <w:p/>
@@ -23081,22 +23109,7 @@
           <w:b w:val="0"/>
           <w:sz w:val="24"/>
         </w:rPr>
-        <w:t>一、本法施行細則第42條第1項第1款規定：「機關依本法第四十條規定洽由其他具有專業能力之機關代辦採購，依下列原則處理：</w:t>
-      </w:r>
-    </w:p>
-    <w:p>
-      <w:pPr>
-        <w:pStyle w:val="a9"/>
-        <w:ind w:left="720" w:hanging="480"/>
-        <w:jc w:val="both"/>
-      </w:pPr>
-      <w:r>
-        <w:rPr>
-          <w:rFonts w:ascii="新細明體" w:hAnsi="新細明體" w:eastAsia="新細明體"/>
-          <w:b w:val="0"/>
-          <w:sz w:val="24"/>
-        </w:rPr>
-        <w:t>一、關於監辦該採購之上級機關，為洽辦機關之上級機關。但洽辦機關之上級機關得洽請代辦機關之上級機關代行其上級機關之職權。」明定洽辦機關之上級機關得洽請代辦機關之上級機關代行其上級機關之監辦職權。</w:t>
+        <w:t>一、本法施行細則第42條第1項第1款規定：「機關依本法第四十條規定洽由其他具有專業能力之機關代辦採購，依下列原則處理：一、關於監辦該採購之上級機關，為洽辦機關之上級機關。但洽辦機關之上級機關得洽請代辦機關之上級機關代行其上級機關之職權。」明定洽辦機關之上級機關得洽請代辦機關之上級機關代行其上級機關之監辦職權。</w:t>
       </w:r>
     </w:p>
     <w:p>
@@ -23506,7 +23519,7 @@
           <w:b w:val="0"/>
           <w:sz w:val="24"/>
         </w:rPr>
-        <w:t>三、依前揭各項規定辦理之採購，其採購金額屬公告金額十分之一以下之採購，可依「中央機關未達公告金額採購招標辦法」第三條規定辦理；屬未達公告金額但逾公告金額十分之一之採購，則可依「中央機關未達公告金額採購招標辦法」第二條規定辦理；至屬公告金額以上之採購，如符合本法第二十條規定之各款情形，報經上級機關核准，得採選擇性招標方式辦理，其中經常性採購依本法第二十一條第三項規定，應建立六家以上之合格廠商名單。附註：本會已於八十八年八月二十四日以（八八）工程企字第八八一二六Ｏ一號令修正發布「中央機關未達公告金額採購招標辦法」。</w:t>
+        <w:t>三、依前揭各項規定辦理之採購，其採購金額屬公告金額十分之一以下之採購，可依「中央機關未達公告金額採購招標辦法」第三條規定辦理；屬未達公告金額但逾公告金額十分之一之採購，則可依「中央機關未達公告金額採購招標辦法」第二條規定辦理；至屬公告金額以上之採購，如符合本法第二十條規定之各款情形，報經上級機關核准，得採選擇性招標方式辦理，其中經常性採購依本法第二十一條第三項規定，應建立六家以上之合格廠商名單。附註：本會已於八十八年八月二十四日以（八八）工程企字第八八一二六〇一號令修正發布「中央機關未達公告金額採購招標辦法」。</w:t>
       </w:r>
     </w:p>
     <w:p>
@@ -23658,7 +23671,7 @@
           <w:b w:val="0"/>
           <w:sz w:val="24"/>
         </w:rPr>
-        <w:t>一、復貴局八十八年七月十九日88高市環局修字第Ｏ二六四九七號函。</w:t>
+        <w:t>一、復貴局八十八年七月十九日88高市環局修字第〇二六四九七號函。</w:t>
       </w:r>
     </w:p>
     <w:p>
@@ -25063,7 +25076,7 @@
           <w:b w:val="0"/>
           <w:sz w:val="24"/>
         </w:rPr>
-        <w:t>說明：復貴公所八十八年八月三十日八八肚鄉托字第一一ＯＯＯ號函。</w:t>
+        <w:t>說明：復貴公所八十八年八月三十日八八肚鄉托字第一一〇〇〇號函。</w:t>
       </w:r>
     </w:p>
     <w:p/>
@@ -25579,7 +25592,7 @@
           <w:b w:val="0"/>
           <w:sz w:val="24"/>
         </w:rPr>
-        <w:t>一、依據中華民國認證委員會九十二年九月二日認字第０九二００００二三八０號函辦理。</w:t>
+        <w:t>一、依據中華民國認證委員會九十二年九月二日認字第〇九二〇〇〇〇二三八〇號函辦理。</w:t>
       </w:r>
     </w:p>
     <w:p>
@@ -25823,7 +25836,7 @@
           <w:b w:val="0"/>
           <w:sz w:val="24"/>
         </w:rPr>
-        <w:t>一、復貴公司八十八年五月二十五日(八八)和業字第００三二號函。</w:t>
+        <w:t>一、復貴公司八十八年五月二十五日(八八)和業字第〇〇三二號函。</w:t>
       </w:r>
     </w:p>
     <w:p>
@@ -26719,7 +26732,7 @@
           <w:b/>
           <w:sz w:val="24"/>
         </w:rPr>
-        <w:t>行政院公共工程委員會100年03月31日工程企字第10000098340號會議紀錄函</w:t>
+        <w:t>行政院公共工程委員會100年03月31日工程企字第10000098340號會議紀錄</w:t>
       </w:r>
     </w:p>
     <w:p>
@@ -27980,22 +27993,22 @@
           <w:b w:val="0"/>
           <w:sz w:val="24"/>
         </w:rPr>
-        <w:t>一、復貴校九十一年九月九日塗小總字第０九一０００六六二００號函。</w:t>
-      </w:r>
-    </w:p>
-    <w:p>
-      <w:pPr>
-        <w:pStyle w:val="a9"/>
-        <w:ind w:left="720" w:hanging="480"/>
-        <w:jc w:val="both"/>
-      </w:pPr>
-      <w:r>
-        <w:rPr>
-          <w:rFonts w:ascii="新細明體" w:hAnsi="新細明體" w:eastAsia="新細明體"/>
-          <w:b w:val="0"/>
-          <w:sz w:val="24"/>
-        </w:rPr>
-        <w:t>二、有關營業項目乙節，請參閱本會九十年十二月廿六日(九十)工程企字第九００五一四八四號函附會議紀錄（已公開於本會網站）。三、目前政府財政困難，各機關使用預算辦理採購，本應依編定該預算之原始目的撙節開支。貴校利用旨揭剩餘款採購宣導Ｔ侐及資料袋(公事包)是否妥適，請審慎檢討。</w:t>
+        <w:t>一、復貴校九十一年九月九日塗小總字第〇九一〇〇〇六六二〇〇號函。</w:t>
+      </w:r>
+    </w:p>
+    <w:p>
+      <w:pPr>
+        <w:pStyle w:val="a9"/>
+        <w:ind w:left="720" w:hanging="480"/>
+        <w:jc w:val="both"/>
+      </w:pPr>
+      <w:r>
+        <w:rPr>
+          <w:rFonts w:ascii="新細明體" w:hAnsi="新細明體" w:eastAsia="新細明體"/>
+          <w:b w:val="0"/>
+          <w:sz w:val="24"/>
+        </w:rPr>
+        <w:t>二、有關營業項目乙節，請參閱本會九十年十二月廿六日(九十)工程企字第九〇〇五一四八四號函附會議紀錄（已公開於本會網站）。三、目前政府財政困難，各機關使用預算辦理採購，本應依編定該預算之原始目的撙節開支。貴校利用旨揭剩餘款採購宣導Ｔ侐及資料袋(公事包)是否妥適，請審慎檢討。</w:t>
       </w:r>
     </w:p>
     <w:p/>
@@ -28567,7 +28580,7 @@
           <w:b w:val="0"/>
           <w:sz w:val="24"/>
         </w:rPr>
-        <w:t>一、復貴局九十三年二月五日新廣三字第０九二００二三二七三號函。</w:t>
+        <w:t>一、復貴局九十三年二月五日新廣三字第〇九二〇〇二三二七三號函。</w:t>
       </w:r>
     </w:p>
     <w:p>
@@ -31471,7 +31484,202 @@
           <w:b w:val="0"/>
           <w:sz w:val="24"/>
         </w:rPr>
-        <w:t>主旨：為因應COVID-19（武漢肺炎）疫情對經濟之衝擊，請加速公共建設執行一案，請查照。說明：一、依據行政院秘書長109年2月18日院臺衛字第1090164438號函辦理。二、院長於109年2月13日行政院第3689次會議就「因應COVID-19（武漢肺炎）疫情相關措施」報告，決定四、(四)「加速公共建設的推動：鑑於92年SARS期間公共支出趨緩，當年GDP也受影響。因此，值此疫情影響各項經濟活動之際，更需中央及地方政府大力並加速投入公共建設，以帶動經濟發展。請國發會、工程會切實列管公共建設辦理情形，全力協助加速公共建設之推動。」。三、有關院長指示加速公共建設之推動，本會相關建議措施如下:(一)109年度預算加速執行：１、各機關就109年度工程，採取適當分標等方式，加速設計、發包及執行，以提早完成設計及相關作業。２、各項計畫之前置作業，請各機關務必全面檢視盤點，並提早完成，讓後續工程推動能夠順利進行。３、關於補助型計畫，請各機關務必確實盤點，並提早啟動各項審查及行政作業，確實掌握計畫執行進度及落實督導受補助單位儘速辦理。(二)110年度預算提前辦理：１、有關110年度工程計畫預算編列事宜，請各機關儘早開始，並依主計總處之各機關編製年度單位預算案應行注意辦理事項規定辦理。２、工程規劃設計階段所需經費通常較施工階段少，主辦機關可於109年度預算額度內勻支或採取追加預算方式，先行辦理預定下一年度工程之規劃設計及核定作業，俾利110年度預算通過後即發包施工。３、請確實依行政院108年12月12日修正之「各機關單位預算執行要點」第16點第2項辦理，即「各機關辦理各項公共工程及房屋建築計畫，應自設定建造標準時，即審酌其工程定位及功能，對應提出妥適之建造標準，並從預算編列、設計、施工、監造到驗收各階段，均依所設定之建造標準落實執行，以有效運用政府預算」。四、本會將持續列管重大公共建設計畫執行情形及其進度，協助各機關全力排除阻礙。請貴機關對於109年度既有預算加速執行，110年度預算提前辦理，發揮提早及補位之效益。</w:t>
+        <w:t>主旨：為因應COVID-19（武漢肺炎）疫情對經濟之衝擊，請加速公共建設執行一案，請查照。</w:t>
+      </w:r>
+    </w:p>
+    <w:p>
+      <w:pPr>
+        <w:pStyle w:val="a9"/>
+        <w:ind w:left="720" w:hanging="720"/>
+        <w:jc w:val="both"/>
+      </w:pPr>
+      <w:r>
+        <w:rPr>
+          <w:rFonts w:ascii="新細明體" w:hAnsi="新細明體" w:eastAsia="新細明體"/>
+          <w:b w:val="0"/>
+          <w:sz w:val="24"/>
+        </w:rPr>
+        <w:t>說明：</w:t>
+      </w:r>
+    </w:p>
+    <w:p>
+      <w:pPr>
+        <w:pStyle w:val="a9"/>
+        <w:ind w:left="720" w:hanging="480"/>
+        <w:jc w:val="both"/>
+      </w:pPr>
+      <w:r>
+        <w:rPr>
+          <w:rFonts w:ascii="新細明體" w:hAnsi="新細明體" w:eastAsia="新細明體"/>
+          <w:b w:val="0"/>
+          <w:sz w:val="24"/>
+        </w:rPr>
+        <w:t>一、依據行政院秘書長109年2月18日院臺衛字第1090164438號函辦理。</w:t>
+      </w:r>
+    </w:p>
+    <w:p>
+      <w:pPr>
+        <w:pStyle w:val="a9"/>
+        <w:ind w:left="720" w:hanging="480"/>
+        <w:jc w:val="both"/>
+      </w:pPr>
+      <w:r>
+        <w:rPr>
+          <w:rFonts w:ascii="新細明體" w:hAnsi="新細明體" w:eastAsia="新細明體"/>
+          <w:b w:val="0"/>
+          <w:sz w:val="24"/>
+        </w:rPr>
+        <w:t>二、院長於109年2月13日行政院第3689次會議就「因應COVID-19（武漢肺炎）疫情相關措施」報告，決定四、(四)「加速公共建設的推動：鑑於92年SARS期間公共支出趨緩，當年GDP也受影響。因此，值此疫情影響各項經濟活動之際，更需中央及地方政府大力並加速投入公共建設，以帶動經濟發展。請國發會、工程會切實列管公共建設辦理情形，全力協助加速公共建設之推動。」。</w:t>
+      </w:r>
+    </w:p>
+    <w:p>
+      <w:pPr>
+        <w:pStyle w:val="a9"/>
+        <w:ind w:left="720" w:hanging="480"/>
+        <w:jc w:val="both"/>
+      </w:pPr>
+      <w:r>
+        <w:rPr>
+          <w:rFonts w:ascii="新細明體" w:hAnsi="新細明體" w:eastAsia="新細明體"/>
+          <w:b w:val="0"/>
+          <w:sz w:val="24"/>
+        </w:rPr>
+        <w:t>三、有關院長指示加速公共建設之推動，本會相關建議措施如下:</w:t>
+      </w:r>
+    </w:p>
+    <w:p>
+      <w:pPr>
+        <w:pStyle w:val="a9"/>
+        <w:ind w:left="964" w:hanging="680"/>
+        <w:jc w:val="both"/>
+      </w:pPr>
+      <w:r>
+        <w:rPr>
+          <w:rFonts w:ascii="新細明體" w:hAnsi="新細明體" w:eastAsia="新細明體"/>
+          <w:b w:val="0"/>
+          <w:sz w:val="24"/>
+        </w:rPr>
+        <w:t>（一）109年度預算加速執行：</w:t>
+      </w:r>
+    </w:p>
+    <w:p>
+      <w:pPr>
+        <w:pStyle w:val="a9"/>
+        <w:ind w:left="1225" w:hanging="397"/>
+        <w:jc w:val="both"/>
+      </w:pPr>
+      <w:r>
+        <w:rPr>
+          <w:rFonts w:ascii="新細明體" w:hAnsi="新細明體" w:eastAsia="新細明體"/>
+          <w:b w:val="0"/>
+          <w:sz w:val="24"/>
+        </w:rPr>
+        <w:t>１、各機關就109年度工程，採取適當分標等方式，加速設計、發包及執行，以提早完成設計及相關作業。</w:t>
+      </w:r>
+    </w:p>
+    <w:p>
+      <w:pPr>
+        <w:pStyle w:val="a9"/>
+        <w:ind w:left="1225" w:hanging="397"/>
+        <w:jc w:val="both"/>
+      </w:pPr>
+      <w:r>
+        <w:rPr>
+          <w:rFonts w:ascii="新細明體" w:hAnsi="新細明體" w:eastAsia="新細明體"/>
+          <w:b w:val="0"/>
+          <w:sz w:val="24"/>
+        </w:rPr>
+        <w:t>２、各項計畫之前置作業，請各機關務必全面檢視盤點，並提早完成，讓後續工程推動能夠順利進行。</w:t>
+      </w:r>
+    </w:p>
+    <w:p>
+      <w:pPr>
+        <w:pStyle w:val="a9"/>
+        <w:ind w:left="1225" w:hanging="397"/>
+        <w:jc w:val="both"/>
+      </w:pPr>
+      <w:r>
+        <w:rPr>
+          <w:rFonts w:ascii="新細明體" w:hAnsi="新細明體" w:eastAsia="新細明體"/>
+          <w:b w:val="0"/>
+          <w:sz w:val="24"/>
+        </w:rPr>
+        <w:t>３、關於補助型計畫，請各機關務必確實盤點，並提早啟動各項審查及行政作業，確實掌握計畫執行進度及落實督導受補助單位儘速辦理。</w:t>
+      </w:r>
+    </w:p>
+    <w:p>
+      <w:pPr>
+        <w:pStyle w:val="a9"/>
+        <w:ind w:left="964" w:hanging="680"/>
+        <w:jc w:val="both"/>
+      </w:pPr>
+      <w:r>
+        <w:rPr>
+          <w:rFonts w:ascii="新細明體" w:hAnsi="新細明體" w:eastAsia="新細明體"/>
+          <w:b w:val="0"/>
+          <w:sz w:val="24"/>
+        </w:rPr>
+        <w:t>（二）110年度預算提前辦理：</w:t>
+      </w:r>
+    </w:p>
+    <w:p>
+      <w:pPr>
+        <w:pStyle w:val="a9"/>
+        <w:ind w:left="1225" w:hanging="397"/>
+        <w:jc w:val="both"/>
+      </w:pPr>
+      <w:r>
+        <w:rPr>
+          <w:rFonts w:ascii="新細明體" w:hAnsi="新細明體" w:eastAsia="新細明體"/>
+          <w:b w:val="0"/>
+          <w:sz w:val="24"/>
+        </w:rPr>
+        <w:t>１、有關110年度工程計畫預算編列事宜，請各機關儘早開始，並依主計總處之各機關編製年度單位預算案應行注意辦理事項規定辦理。</w:t>
+      </w:r>
+    </w:p>
+    <w:p>
+      <w:pPr>
+        <w:pStyle w:val="a9"/>
+        <w:ind w:left="1225" w:hanging="397"/>
+        <w:jc w:val="both"/>
+      </w:pPr>
+      <w:r>
+        <w:rPr>
+          <w:rFonts w:ascii="新細明體" w:hAnsi="新細明體" w:eastAsia="新細明體"/>
+          <w:b w:val="0"/>
+          <w:sz w:val="24"/>
+        </w:rPr>
+        <w:t>２、工程規劃設計階段所需經費通常較施工階段少，主辦機關可於109年度預算額度內勻支或採取追加預算方式，先行辦理預定下一年度工程之規劃設計及核定作業，俾利110年度預算通過後即發包施工。</w:t>
+      </w:r>
+    </w:p>
+    <w:p>
+      <w:pPr>
+        <w:pStyle w:val="a9"/>
+        <w:ind w:left="1225" w:hanging="397"/>
+        <w:jc w:val="both"/>
+      </w:pPr>
+      <w:r>
+        <w:rPr>
+          <w:rFonts w:ascii="新細明體" w:hAnsi="新細明體" w:eastAsia="新細明體"/>
+          <w:b w:val="0"/>
+          <w:sz w:val="24"/>
+        </w:rPr>
+        <w:t>３、請確實依行政院108年12月12日修正之「各機關單位預算執行要點」第16點第2項辦理，即「各機關辦理各項公共工程及房屋建築計畫，應自設定建造標準時，即審酌其工程定位及功能，對應提出妥適之建造標準，並從預算編列、設計、施工、監造到驗收各階段，均依所設定之建造標準落實執行，以有效運用政府預算」。</w:t>
+      </w:r>
+    </w:p>
+    <w:p>
+      <w:pPr>
+        <w:pStyle w:val="a9"/>
+        <w:ind w:left="720" w:hanging="480"/>
+        <w:jc w:val="both"/>
+      </w:pPr>
+      <w:r>
+        <w:rPr>
+          <w:rFonts w:ascii="新細明體" w:hAnsi="新細明體" w:eastAsia="新細明體"/>
+          <w:b w:val="0"/>
+          <w:sz w:val="24"/>
+        </w:rPr>
+        <w:t>四、本會將持續列管重大公共建設計畫執行情形及其進度，協助各機關全力排除阻礙。請貴機關對於109年度既有預算加速執行，110年度預算提前辦理，發揮提早及補位之效益。</w:t>
       </w:r>
     </w:p>
     <w:p/>
@@ -32559,21 +32767,125 @@
           <w:sz w:val="24"/>
         </w:rPr>
         <w:t>主旨：為因應近期原物料價格波動，貴機關辦理工程採購，請本公共工程全生命週期思維務實考量，詳如說明，以利公共工程執行，請查照並轉知所屬機關照辦。</w:t>
-        <w:br/>
-        <w:t>說明：</w:t>
-        <w:br/>
+      </w:r>
+    </w:p>
+    <w:p>
+      <w:pPr>
+        <w:pStyle w:val="a9"/>
+        <w:ind w:left="720" w:hanging="720"/>
+        <w:jc w:val="both"/>
+      </w:pPr>
+      <w:r>
+        <w:rPr>
+          <w:rFonts w:ascii="新細明體" w:hAnsi="新細明體" w:eastAsia="新細明體"/>
+          <w:b w:val="0"/>
+          <w:sz w:val="24"/>
+        </w:rPr>
+        <w:t>說明：</w:t>
+      </w:r>
+    </w:p>
+    <w:p>
+      <w:pPr>
+        <w:pStyle w:val="a9"/>
+        <w:ind w:left="720" w:hanging="480"/>
+        <w:jc w:val="both"/>
+      </w:pPr>
+      <w:r>
+        <w:rPr>
+          <w:rFonts w:ascii="新細明體" w:hAnsi="新細明體" w:eastAsia="新細明體"/>
+          <w:b w:val="0"/>
+          <w:sz w:val="24"/>
+        </w:rPr>
         <w:t>一、依110年10月4日立法院第10屆第4會期交通委員會第3次全體委員會議立法委員蘇震清質詢意見辦理。</w:t>
-        <w:br/>
+      </w:r>
+    </w:p>
+    <w:p>
+      <w:pPr>
+        <w:pStyle w:val="a9"/>
+        <w:ind w:left="720" w:hanging="480"/>
+        <w:jc w:val="both"/>
+      </w:pPr>
+      <w:r>
+        <w:rPr>
+          <w:rFonts w:ascii="新細明體" w:hAnsi="新細明體" w:eastAsia="新細明體"/>
+          <w:b w:val="0"/>
+          <w:sz w:val="24"/>
+        </w:rPr>
         <w:t>二、邇來媒體報導，因物價上漲等因素導致工程流標，經本會統計及召開個案流標檢討會議，主因為「預算不足」、「工期不實」及「設計書圖契約不合理」，爰機關辦理公共工程，應將全生命週期各階段納入考量，掌握本身需求，瞭解建設計畫的設定目標與定位，考量市場行情編列合理預算，供設計依循；設計成果並須符合原計畫之定位及預算範圍，相關材料、設備、工法、工期、現場施工條件環境等並合理可行，以利工程順利推動。</w:t>
-        <w:br/>
+      </w:r>
+    </w:p>
+    <w:p>
+      <w:pPr>
+        <w:pStyle w:val="a9"/>
+        <w:ind w:left="720" w:hanging="480"/>
+        <w:jc w:val="both"/>
+      </w:pPr>
+      <w:r>
+        <w:rPr>
+          <w:rFonts w:ascii="新細明體" w:hAnsi="新細明體" w:eastAsia="新細明體"/>
+          <w:b w:val="0"/>
+          <w:sz w:val="24"/>
+        </w:rPr>
         <w:t>三、各生命週期階段應注意重點如下：</w:t>
-        <w:br/>
+      </w:r>
+    </w:p>
+    <w:p>
+      <w:pPr>
+        <w:pStyle w:val="a9"/>
+        <w:ind w:left="964" w:hanging="680"/>
+        <w:jc w:val="both"/>
+      </w:pPr>
+      <w:r>
+        <w:rPr>
+          <w:rFonts w:ascii="新細明體" w:hAnsi="新細明體" w:eastAsia="新細明體"/>
+          <w:b w:val="0"/>
+          <w:sz w:val="24"/>
+        </w:rPr>
         <w:t>（一）在「計畫階段」，應考慮當時物價水準合理編列計畫經費，並就未來至完工時可能之物價漲幅，編列物價調整費，以因應工程決標前及履約期間之物價上漲費用。其次，在「設計階段」，因與計畫核定有時間差，機關或技術服務廠商編列設計預算，除應配合當時物價編列外，亦應針對其後之物價調整編列費用。</w:t>
-        <w:br/>
+      </w:r>
+    </w:p>
+    <w:p>
+      <w:pPr>
+        <w:pStyle w:val="a9"/>
+        <w:ind w:left="964" w:hanging="680"/>
+        <w:jc w:val="both"/>
+      </w:pPr>
+      <w:r>
+        <w:rPr>
+          <w:rFonts w:ascii="新細明體" w:hAnsi="新細明體" w:eastAsia="新細明體"/>
+          <w:b w:val="0"/>
+          <w:sz w:val="24"/>
+        </w:rPr>
         <w:t>（二）在「招標階段」，機關應於工程發包前再次檢核原核定之工程預算是否符合當下之市場行情，並作必要之調整；另為合理分擔契約雙方對於物價漲跌之風險，本會已於107年7月修正工程採購契約範本，訂定依序按個別項目、中分類項目及總指數漲跌幅調整契約價金，以合理分配機關及廠商履約階段所受物價波動之風險。</w:t>
-        <w:br/>
+      </w:r>
+    </w:p>
+    <w:p>
+      <w:pPr>
+        <w:pStyle w:val="a9"/>
+        <w:ind w:left="964" w:hanging="680"/>
+        <w:jc w:val="both"/>
+      </w:pPr>
+      <w:r>
+        <w:rPr>
+          <w:rFonts w:ascii="新細明體" w:hAnsi="新細明體" w:eastAsia="新細明體"/>
+          <w:b w:val="0"/>
+          <w:sz w:val="24"/>
+        </w:rPr>
         <w:t>（三）在「履約階段」，若契約未約定物調機制或未有前述三層級物調機制案件，於履約中遇物價有契約成立時不可預期之大幅波動情形時，契約雙方得參酌民法情事變更之規定及本會契約範本之三層級物調機制，辦理契約變更，及時因應物價之變動。本會109年8月31日工程企字第1090100596號函、110年2月9日工程企字第1100100065號函（上開2函均公開於本會網站，https://planpe.pcc.gov.tw/prms/）併請參考。</w:t>
-        <w:br/>
+      </w:r>
+    </w:p>
+    <w:p>
+      <w:pPr>
+        <w:pStyle w:val="a9"/>
+        <w:ind w:left="720" w:hanging="480"/>
+        <w:jc w:val="both"/>
+      </w:pPr>
+      <w:r>
+        <w:rPr>
+          <w:rFonts w:ascii="新細明體" w:hAnsi="新細明體" w:eastAsia="新細明體"/>
+          <w:b w:val="0"/>
+          <w:sz w:val="24"/>
+        </w:rPr>
         <w:t>四、另前述有關營造工程物價指數之個別項目、中分類項目及總指數漲跌幅調整工程款之機制，係載明於本會訂定之工程採購契約範本第5條，按政府採購法第63條第1項規定：「各類採購契約以採用主管機關訂定之範本為原則，其要項及內容由主管機關參考國際及國內慣例定之。」除有個案特殊情形外，請納入個案契約，俾履約期間受物價波動之影響時，可合理調整工程款。</w:t>
       </w:r>
     </w:p>
@@ -32606,11 +32918,50 @@
           <w:sz w:val="24"/>
         </w:rPr>
         <w:t>主旨：為因應「文化藝術獎助及促進條例」第10條自民國111年5月1日施行，機關辦理藝文採購案件，其預算編列應納入廠商為法定勞務提供者投保所需費用，請查照並轉知所屬。</w:t>
-        <w:br/>
-        <w:t>說明：</w:t>
-        <w:br/>
+      </w:r>
+    </w:p>
+    <w:p>
+      <w:pPr>
+        <w:pStyle w:val="a9"/>
+        <w:ind w:left="720" w:hanging="720"/>
+        <w:jc w:val="both"/>
+      </w:pPr>
+      <w:r>
+        <w:rPr>
+          <w:rFonts w:ascii="新細明體" w:hAnsi="新細明體" w:eastAsia="新細明體"/>
+          <w:b w:val="0"/>
+          <w:sz w:val="24"/>
+        </w:rPr>
+        <w:t>說明：</w:t>
+      </w:r>
+    </w:p>
+    <w:p>
+      <w:pPr>
+        <w:pStyle w:val="a9"/>
+        <w:ind w:left="720" w:hanging="480"/>
+        <w:jc w:val="both"/>
+      </w:pPr>
+      <w:r>
+        <w:rPr>
+          <w:rFonts w:ascii="新細明體" w:hAnsi="新細明體" w:eastAsia="新細明體"/>
+          <w:b w:val="0"/>
+          <w:sz w:val="24"/>
+        </w:rPr>
         <w:t>一、依據行政院111年2月8日院臺文字第1110002470B號函辦理。</w:t>
-        <w:br/>
+      </w:r>
+    </w:p>
+    <w:p>
+      <w:pPr>
+        <w:pStyle w:val="a9"/>
+        <w:ind w:left="720" w:hanging="480"/>
+        <w:jc w:val="both"/>
+      </w:pPr>
+      <w:r>
+        <w:rPr>
+          <w:rFonts w:ascii="新細明體" w:hAnsi="新細明體" w:eastAsia="新細明體"/>
+          <w:b w:val="0"/>
+          <w:sz w:val="24"/>
+        </w:rPr>
         <w:t>二、旨揭條例第10條規定：「廠商承辦政府機關（構）、公立學校及公營事業之藝文採購，應為該採購案件中與廠商直接發生契約關係而未能投保職業災害保險之勞務提供者，投保含有傷害、失能及死亡保障之其他商業保險。」行政院依該條例第35條定第10條自111年5月1日施行，依前開規定廠商履行藝文採購案時應為上開法定範圍之勞務提供者投保，所增加之費用，請於辦理藝文採購編列預算時將保險費用納入，俾利廠商依法投保。</w:t>
       </w:r>
     </w:p>
@@ -33606,15 +33957,80 @@
           <w:sz w:val="24"/>
         </w:rPr>
         <w:t>主旨：重申請貴機關督促所屬就新設計及發包之公共工程，應個案工程做好瀝青混凝土挖(刨)除料之再利用處理，不應再沿用舊有規定僅編列折價要求廠商價購，詳如說明，請查照。</w:t>
-        <w:br/>
-        <w:t>說明：</w:t>
-        <w:br/>
+      </w:r>
+    </w:p>
+    <w:p>
+      <w:pPr>
+        <w:pStyle w:val="a9"/>
+        <w:ind w:left="720" w:hanging="720"/>
+        <w:jc w:val="both"/>
+      </w:pPr>
+      <w:r>
+        <w:rPr>
+          <w:rFonts w:ascii="新細明體" w:hAnsi="新細明體" w:eastAsia="新細明體"/>
+          <w:b w:val="0"/>
+          <w:sz w:val="24"/>
+        </w:rPr>
+        <w:t>說明：</w:t>
+      </w:r>
+    </w:p>
+    <w:p>
+      <w:pPr>
+        <w:pStyle w:val="a9"/>
+        <w:ind w:left="720" w:hanging="480"/>
+        <w:jc w:val="both"/>
+      </w:pPr>
+      <w:r>
+        <w:rPr>
+          <w:rFonts w:ascii="新細明體" w:hAnsi="新細明體" w:eastAsia="新細明體"/>
+          <w:b w:val="0"/>
+          <w:sz w:val="24"/>
+        </w:rPr>
         <w:t>一、依據本會113年1月2日工程技字第1120201306號函，檢送本會112年12月25日召開之「再生粒料運用於公共工程跨部會推動小組」第23次會議紀錄結論三(一)辦理。</w:t>
-        <w:br/>
+      </w:r>
+    </w:p>
+    <w:p>
+      <w:pPr>
+        <w:pStyle w:val="a9"/>
+        <w:ind w:left="720" w:hanging="480"/>
+        <w:jc w:val="both"/>
+      </w:pPr>
+      <w:r>
+        <w:rPr>
+          <w:rFonts w:ascii="新細明體" w:hAnsi="新細明體" w:eastAsia="新細明體"/>
+          <w:b w:val="0"/>
+          <w:sz w:val="24"/>
+        </w:rPr>
         <w:t>二、行政院96年7月26日已函發各部會行處局署、省市政府、各縣市政府、台灣區瀝青工業同業公會，「各機關辦理瀝青混凝土資源再利用作業要點」自即日起停止適用。爰有關「將AC刨除料賸餘價值，以折價項目編列」規定已不存在。另該作業要點停止適用之原因係內政部於96年4月23日已公告將AC刨除料納入該部「營建事業再生利用之再生資源項目及規範」。</w:t>
-        <w:br/>
+      </w:r>
+    </w:p>
+    <w:p>
+      <w:pPr>
+        <w:pStyle w:val="a9"/>
+        <w:ind w:left="720" w:hanging="480"/>
+        <w:jc w:val="both"/>
+      </w:pPr>
+      <w:r>
+        <w:rPr>
+          <w:rFonts w:ascii="新細明體" w:hAnsi="新細明體" w:eastAsia="新細明體"/>
+          <w:b w:val="0"/>
+          <w:sz w:val="24"/>
+        </w:rPr>
         <w:t>三、依內政部上開規範，AC刨除料再生利用用途包括:瀝青混凝土鋪面原料、級配粒料基層、底層材料及非農業用地之工程填方材料，不包含編列折價要求廠商價購。</w:t>
-        <w:br/>
+      </w:r>
+    </w:p>
+    <w:p>
+      <w:pPr>
+        <w:pStyle w:val="a9"/>
+        <w:ind w:left="720" w:hanging="480"/>
+        <w:jc w:val="both"/>
+      </w:pPr>
+      <w:r>
+        <w:rPr>
+          <w:rFonts w:ascii="新細明體" w:hAnsi="新細明體" w:eastAsia="新細明體"/>
+          <w:b w:val="0"/>
+          <w:sz w:val="24"/>
+        </w:rPr>
         <w:t>四、本項本會先前一再要求各機關不應再依前述已停止適用之要點辦理，後續如有機關仍再沿用採編列折價要求廠商回購AC刨除料之情形，本會將轉請主辦機關之上級首長，就失職人員嚴厲處分。</w:t>
       </w:r>
     </w:p>
@@ -33662,17 +34078,95 @@
           <w:sz w:val="24"/>
         </w:rPr>
         <w:t>主旨：本會112年12月25日「再生粒料運用於公共工程跨部會推動小組」第23次會議結論，有關瀝青混凝土挖(刨)除料規劃使用及編列處理費用之原則，補充詳如說明，請查照。</w:t>
-        <w:br/>
-        <w:t>說明：</w:t>
-        <w:br/>
+      </w:r>
+    </w:p>
+    <w:p>
+      <w:pPr>
+        <w:pStyle w:val="a9"/>
+        <w:ind w:left="720" w:hanging="720"/>
+        <w:jc w:val="both"/>
+      </w:pPr>
+      <w:r>
+        <w:rPr>
+          <w:rFonts w:ascii="新細明體" w:hAnsi="新細明體" w:eastAsia="新細明體"/>
+          <w:b w:val="0"/>
+          <w:sz w:val="24"/>
+        </w:rPr>
+        <w:t>說明：</w:t>
+      </w:r>
+    </w:p>
+    <w:p>
+      <w:pPr>
+        <w:pStyle w:val="a9"/>
+        <w:ind w:left="720" w:hanging="480"/>
+        <w:jc w:val="both"/>
+      </w:pPr>
+      <w:r>
+        <w:rPr>
+          <w:rFonts w:ascii="新細明體" w:hAnsi="新細明體" w:eastAsia="新細明體"/>
+          <w:b w:val="0"/>
+          <w:sz w:val="24"/>
+        </w:rPr>
         <w:t>一、依據本會113年1月8日工程技字第1130200017號函(諒達)附本會112年12月25日召開之「再生粒料運用於公共工程跨部會推動小組」第23次會議紀錄結論續辦。</w:t>
-        <w:br/>
+      </w:r>
+    </w:p>
+    <w:p>
+      <w:pPr>
+        <w:pStyle w:val="a9"/>
+        <w:ind w:left="720" w:hanging="480"/>
+        <w:jc w:val="both"/>
+      </w:pPr>
+      <w:r>
+        <w:rPr>
+          <w:rFonts w:ascii="新細明體" w:hAnsi="新細明體" w:eastAsia="新細明體"/>
+          <w:b w:val="0"/>
+          <w:sz w:val="24"/>
+        </w:rPr>
         <w:t>二、依上開會議結論三(二)，略以:為達成瀝青混凝土挖(刨)除料(下稱AC刨除料)「刨用平衡」之目標，請各工程主管機關及縣市政府負責督促轄內工程，從個案工程設計階段即規劃使用AC刨除料，並可視各案工程產出時程及使用量能協調調度於轄內他工程使用，至於經綜整轄內所有工程需求仍無法完全去化者，亦應編列合理處理費用，不應再僅編列折價要求廠商回購。</w:t>
-        <w:br/>
+      </w:r>
+    </w:p>
+    <w:p>
+      <w:pPr>
+        <w:pStyle w:val="a9"/>
+        <w:ind w:left="720" w:hanging="480"/>
+        <w:jc w:val="both"/>
+      </w:pPr>
+      <w:r>
+        <w:rPr>
+          <w:rFonts w:ascii="新細明體" w:hAnsi="新細明體" w:eastAsia="新細明體"/>
+          <w:b w:val="0"/>
+          <w:sz w:val="24"/>
+        </w:rPr>
         <w:t>三、上述有關AC刨除料規劃使用及編列處理費用之原則，係以「刨用平衡」為目標，工程主辦機關應於個案工程設計階段即妥善規劃AC刨除料使用方式，若無法完全去化時，應編列處理費用，相關原則再予補充說明如下:</w:t>
-        <w:br/>
+      </w:r>
+    </w:p>
+    <w:p>
+      <w:pPr>
+        <w:pStyle w:val="a9"/>
+        <w:ind w:left="964" w:hanging="680"/>
+        <w:jc w:val="both"/>
+      </w:pPr>
+      <w:r>
+        <w:rPr>
+          <w:rFonts w:ascii="新細明體" w:hAnsi="新細明體" w:eastAsia="新細明體"/>
+          <w:b w:val="0"/>
+          <w:sz w:val="24"/>
+        </w:rPr>
         <w:t>（一）個案工程如有產出AC刨除料時，各工程主辦機關於設計階段，即應依內政部「營建事業再生利用之再生資源項目及規範」之再生利用用途(包括:瀝青混凝土鋪面原料、級配粒料基層材料、級配粒料底層材料、非農業用地之工程填方材料)，妥為規劃使用AC刨除料，並納入契約落實執行。</w:t>
-        <w:br/>
+      </w:r>
+    </w:p>
+    <w:p>
+      <w:pPr>
+        <w:pStyle w:val="a9"/>
+        <w:ind w:left="964" w:hanging="680"/>
+        <w:jc w:val="both"/>
+      </w:pPr>
+      <w:r>
+        <w:rPr>
+          <w:rFonts w:ascii="新細明體" w:hAnsi="新細明體" w:eastAsia="新細明體"/>
+          <w:b w:val="0"/>
+          <w:sz w:val="24"/>
+        </w:rPr>
         <w:t>（二）個案工程為處理本工程產出之AC刨除料，或規劃使用他工程產出之AC刨除料，工程主辦機關於編列工程預算時，應合理編列對應之處理費用，不應再沿用已廢止之「各機關辦理瀝青混凝土資源再利用作業要點」，僅編列折價要求廠商價購。前述處理費用之組成，包括廠商之運輸、堆置、環保、營運管理等成本，並須依AC刨除料之來源(由機關提供或廠商自覓)，就其剩餘價值納入考量。</w:t>
       </w:r>
     </w:p>
@@ -33720,8 +34214,21 @@
           <w:sz w:val="24"/>
         </w:rPr>
         <w:t>主旨：檢送本會與數位發展部研訂之「政府資訊服務採購經費估算編列手冊」，請查照並轉知所屬（轄）機關。</w:t>
-        <w:br/>
-        <w:t>說明：考量各機關之資訊、資安事項多採委外辦理，為利採購機關能充分理解資訊服務採購經費項目之內涵及預算組成，促進資訊服務採購之費用合理化，爰本會偕同數位發展部、資訊服務、資通安全產業界及相關公協會共同研訂旨揭手冊，數位發展部並於113年4月8日提供意見，經彙整後如旨揭手冊，供機關作為編列資訊服務採購預算之參考。</w:t>
+      </w:r>
+    </w:p>
+    <w:p>
+      <w:pPr>
+        <w:pStyle w:val="a9"/>
+        <w:ind w:left="720" w:hanging="720"/>
+        <w:jc w:val="both"/>
+      </w:pPr>
+      <w:r>
+        <w:rPr>
+          <w:rFonts w:ascii="新細明體" w:hAnsi="新細明體" w:eastAsia="新細明體"/>
+          <w:b w:val="0"/>
+          <w:sz w:val="24"/>
+        </w:rPr>
+        <w:t>說明：考量各機關之資訊、資安事項多採委外辦理，為利採購機關能充分理解資訊服務採購經費項目之內涵及預算組成，促進資訊服務採購之費用合理化，爰本會偕同數位發展部、資訊服務、資通安全產業界及相關公協會共同研訂旨揭手冊，數位發展部並於113年4月8日提供意見，經彙整後如旨揭手冊，供機關作為編列資訊服務採購預算之參考。</w:t>
       </w:r>
     </w:p>
     <w:p/>
@@ -34253,7 +34760,7 @@
           <w:b w:val="0"/>
           <w:sz w:val="24"/>
         </w:rPr>
-        <w:t>一、復貴局八十八年六月二十八日標檢(八八)四字第一四七Ｏ五號函。</w:t>
+        <w:t>一、復貴局八十八年六月二十八日標檢(八八)四字第一四七〇五號函。</w:t>
       </w:r>
     </w:p>
     <w:p>
@@ -36851,22 +37358,22 @@
           <w:b/>
           <w:sz w:val="24"/>
         </w:rPr>
-        <w:t>行政院勞工委員會102年02月06日勞綜4字第1020155155號函</w:t>
-      </w:r>
-    </w:p>
-    <w:p>
-      <w:pPr>
-        <w:pStyle w:val="a9"/>
-        <w:ind w:left="720" w:hanging="720"/>
-        <w:jc w:val="both"/>
-      </w:pPr>
-      <w:r>
-        <w:rPr>
-          <w:rFonts w:ascii="新細明體" w:hAnsi="新細明體" w:eastAsia="新細明體"/>
-          <w:b w:val="0"/>
-          <w:sz w:val="24"/>
-        </w:rPr>
-        <w:t>主旨：有關 貴會函請釋明就業服務法第5條第1項規定之適用對象疑義乙案，復如說明。</w:t>
+        <w:t>行政院勞工委員會102年01月17日勞職業字第1020501049號函</w:t>
+      </w:r>
+    </w:p>
+    <w:p>
+      <w:pPr>
+        <w:pStyle w:val="a9"/>
+        <w:ind w:left="720" w:hanging="720"/>
+        <w:jc w:val="both"/>
+      </w:pPr>
+      <w:r>
+        <w:rPr>
+          <w:rFonts w:ascii="新細明體" w:hAnsi="新細明體" w:eastAsia="新細明體"/>
+          <w:b w:val="0"/>
+          <w:sz w:val="24"/>
+        </w:rPr>
+        <w:t>主旨：有關貴會函請釋明就業服務法第5條第1項規定之適用對象疑義乙案，復如說明，請查照。</w:t>
       </w:r>
     </w:p>
     <w:p>
@@ -36896,37 +37403,52 @@
           <w:b w:val="0"/>
           <w:sz w:val="24"/>
         </w:rPr>
-        <w:t>二、有關雇主對求職人或所僱用員工，如限定須具備中華民國身分證者，是否違反就業服務法(以下簡稱本法)第5條第1項所稱禁止「出生地」歧視之規定乙節，依本會93年11月11日以勞職業字第0930204733號令及96年10月24日勞職業字第0960078458號函，所稱求職人或所僱用員工，尚包含具合法工作權之外籍與大陸地區配偶等6類人員，雇主用人選擇應以工作性質、需求及受僱者工作能力為考量，如限定須具備「中華民國身分證者」，即涉違反本法第5條第1項禁止「出生地」就業歧視之虞。</w:t>
-      </w:r>
-    </w:p>
-    <w:p>
-      <w:pPr>
-        <w:pStyle w:val="a9"/>
-        <w:ind w:left="720" w:hanging="480"/>
-        <w:jc w:val="both"/>
-      </w:pPr>
-      <w:r>
-        <w:rPr>
-          <w:rFonts w:ascii="新細明體" w:hAnsi="新細明體" w:eastAsia="新細明體"/>
-          <w:b w:val="0"/>
-          <w:sz w:val="24"/>
-        </w:rPr>
-        <w:t>三、另查本法第5條第1項前段規定略以：「為保障國民就業機會平等，雇主對求職人或所僱用員工，不得以種族、階級...為由，予以歧視；其他法律有明文規定者，從其規定。」，其中所稱「雇主對求職人」，指雇主對於求職人於招募、甄試等成立僱傭(勞動)契約前，不得無正當理由而恣意實施差別待遇。因此有關政府機關辦理委任或定作承攬之採購，允許自然人投標，惟限制須具中華民國國民身分者始得作為投標廠商資格，則非屬本法第5條第1項所定「雇主對求職人」於招募、甄試等成立僱傭(勞動)契約前，禁止歧視行為規範之範圍，尚無本法第5條第1項適用。</w:t>
-      </w:r>
-    </w:p>
-    <w:p>
-      <w:pPr>
-        <w:pStyle w:val="a9"/>
-        <w:ind w:left="720" w:hanging="480"/>
-        <w:jc w:val="both"/>
-      </w:pPr>
-      <w:r>
-        <w:rPr>
-          <w:rFonts w:ascii="新細明體" w:hAnsi="新細明體" w:eastAsia="新細明體"/>
-          <w:b w:val="0"/>
-          <w:sz w:val="24"/>
-        </w:rPr>
-        <w:t>四、有關 貴會提及本會93年10月21日勞職外字第0930206923號令釋略以：就業服務法稱『聘僱』，係以有否提供勞務之事實而為認定...『承攬關係』亦包括在內。」乙節，因外籍勞工之引進程序，雇主須先以合理勞動條件在國內辦理招募，於期限內在國民無意願應徵條件下或就僱用不足人數部分始准許外籍勞工引進補充國內勞動力，凡外籍勞工聘僱與管理均係依本法第5章「外國人之聘僱與管理」之條文及法律授權(第42條至第48條、第57條規定)訂定「雇主聘僱外國人許可及管理辦法」辦理外國人工作許可業務。有關前揭93年10月21日令釋，係緣於外國人未經本會許可，即在臺與他人約定，以完成一定工作(提供勞務之事實認定)，再由該他人給付報酬案，屬「承攬契約」部分，均涉及違反本法第43條、第44條、第57條規定。</w:t>
+        <w:t>一、復貴會101年8月15日工程企字第10100282490號函。</w:t>
+      </w:r>
+    </w:p>
+    <w:p>
+      <w:pPr>
+        <w:pStyle w:val="a9"/>
+        <w:ind w:left="720" w:hanging="480"/>
+        <w:jc w:val="both"/>
+      </w:pPr>
+      <w:r>
+        <w:rPr>
+          <w:rFonts w:ascii="新細明體" w:hAnsi="新細明體" w:eastAsia="新細明體"/>
+          <w:b w:val="0"/>
+          <w:sz w:val="24"/>
+        </w:rPr>
+        <w:t>二、有關雇主對求職人或所僱用員工，如限定須具備中華民國身分證者，是否違反就業服務法（以下簡稱本法）第5條第1項所稱禁止「出生地」歧視之規定乙節，依本會93年11月11日以勞職業字第0930204733號令及96年10月24日勞職業字第0960078458號函，所稱求職人或所僱用員工，尚包含具合法工作權之外籍與大陸地區配偶等6類人員，雇主用人選擇應以工作性質、需求及受僱者工作能力為考量，如限定須具備「中華民國身分證者」，即涉違反本法第5條第1項禁止「出生地」就業歧視之虞。</w:t>
+      </w:r>
+    </w:p>
+    <w:p>
+      <w:pPr>
+        <w:pStyle w:val="a9"/>
+        <w:ind w:left="720" w:hanging="480"/>
+        <w:jc w:val="both"/>
+      </w:pPr>
+      <w:r>
+        <w:rPr>
+          <w:rFonts w:ascii="新細明體" w:hAnsi="新細明體" w:eastAsia="新細明體"/>
+          <w:b w:val="0"/>
+          <w:sz w:val="24"/>
+        </w:rPr>
+        <w:t>三、另查本法第5條第1項前段規定略以：「為保障國民就業機會平等，雇主對求職人或所僱用員工，不得以種族、階級...為由，予以歧視；其他法律有明文規定者，從其規定。」，其中所稱「雇主對求職人」，指雇主對於求職人於招募、甄試等成立僱傭（勞動）契約前，不得無正當理由而恣意實施差別待遇。因此有關政府機關辦理委任或定作承攬之採購，允許自然人投標，惟限制須具中華民國國民身分者始得作為投標廠商資格，則非屬本法第5條第1項所定「雇主對求職人」於招募、甄試等成立僱傭（勞動）契約前，禁止歧視行為規範之範圍，尚無本法第5條第1項適用。</w:t>
+      </w:r>
+    </w:p>
+    <w:p>
+      <w:pPr>
+        <w:pStyle w:val="a9"/>
+        <w:ind w:left="720" w:hanging="480"/>
+        <w:jc w:val="both"/>
+      </w:pPr>
+      <w:r>
+        <w:rPr>
+          <w:rFonts w:ascii="新細明體" w:hAnsi="新細明體" w:eastAsia="新細明體"/>
+          <w:b w:val="0"/>
+          <w:sz w:val="24"/>
+        </w:rPr>
+        <w:t>四、有關貴會提及本會93年10月21日勞職外字第0930206923號令釋略以：「就業服務法稱『聘僱』，係以有否提供勞務之事實而為認定...『承攬關係』亦包括在內。」乙節，因外籍勞工之引進程序，雇主須先以合理勞動條件在國內辦理招募，於期限內在國民無意願應徵條件下或就僱用不足人數部分始准許外籍勞工引進補充國內勞動力，凡外籍勞工聘僱與管理均係依本法第5章「外國人之聘僱與管理」之條文及法律授權（第42條至第48條、第57條規定）訂定「雇主聘僱外國人許可及管理辦法」辦理外國人工作許可業務。有關前揭93年10月21日令釋，係緣於外國人未經本會許可，即在臺與他人約定，以完成一定工作（提供勞務之事實認定），再由該他人給付報酬案，屬「承攬契約」部分，均涉及違反本法第43條、第44條、第57條規定。</w:t>
       </w:r>
     </w:p>
     <w:p/>
@@ -39629,13 +40151,65 @@
           <w:sz w:val="24"/>
         </w:rPr>
         <w:t>主旨：檢送各機關107年度之採購由中小企業承包或分包之比率統計表乙份，請查照並依說明三辦理。</w:t>
-        <w:br/>
-        <w:t>說明：</w:t>
-        <w:br/>
+      </w:r>
+    </w:p>
+    <w:p>
+      <w:pPr>
+        <w:pStyle w:val="a9"/>
+        <w:ind w:left="720" w:hanging="720"/>
+        <w:jc w:val="both"/>
+      </w:pPr>
+      <w:r>
+        <w:rPr>
+          <w:rFonts w:ascii="新細明體" w:hAnsi="新細明體" w:eastAsia="新細明體"/>
+          <w:b w:val="0"/>
+          <w:sz w:val="24"/>
+        </w:rPr>
+        <w:t>說明：</w:t>
+      </w:r>
+    </w:p>
+    <w:p>
+      <w:pPr>
+        <w:pStyle w:val="a9"/>
+        <w:ind w:left="720" w:hanging="480"/>
+        <w:jc w:val="both"/>
+      </w:pPr>
+      <w:r>
+        <w:rPr>
+          <w:rFonts w:ascii="新細明體" w:hAnsi="新細明體" w:eastAsia="新細明體"/>
+          <w:b w:val="0"/>
+          <w:sz w:val="24"/>
+        </w:rPr>
         <w:t>一、依據扶助中小企業參與政府採購辦法第9條規定辦理。</w:t>
-        <w:br/>
+      </w:r>
+    </w:p>
+    <w:p>
+      <w:pPr>
+        <w:pStyle w:val="a9"/>
+        <w:ind w:left="720" w:hanging="480"/>
+        <w:jc w:val="both"/>
+      </w:pPr>
+      <w:r>
+        <w:rPr>
+          <w:rFonts w:ascii="新細明體" w:hAnsi="新細明體" w:eastAsia="新細明體"/>
+          <w:b w:val="0"/>
+          <w:sz w:val="24"/>
+        </w:rPr>
         <w:t>二、本會107年2月21日工程企字第10700046070號函通知各機關，107年度之採購由中小企業承包或分包之目標金額比率為40％。</w:t>
-        <w:br/>
+      </w:r>
+    </w:p>
+    <w:p>
+      <w:pPr>
+        <w:pStyle w:val="a9"/>
+        <w:ind w:left="720" w:hanging="480"/>
+        <w:jc w:val="both"/>
+      </w:pPr>
+      <w:r>
+        <w:rPr>
+          <w:rFonts w:ascii="新細明體" w:hAnsi="新細明體" w:eastAsia="新細明體"/>
+          <w:b w:val="0"/>
+          <w:sz w:val="24"/>
+        </w:rPr>
         <w:t>三、經統計各機關107年度之採購由中小企業承包或分包之金額比率，如附件統計表，未達40％目標之機關，請檢討改進。</w:t>
       </w:r>
     </w:p>
@@ -39668,11 +40242,50 @@
           <w:sz w:val="24"/>
         </w:rPr>
         <w:t>主旨：貴機關及所屬機關108年度之採購，由中小企業承包或分包之目標金額比率，維持與107年度相同之40％，請查照。</w:t>
-        <w:br/>
-        <w:t>說明：</w:t>
-        <w:br/>
+      </w:r>
+    </w:p>
+    <w:p>
+      <w:pPr>
+        <w:pStyle w:val="a9"/>
+        <w:ind w:left="720" w:hanging="720"/>
+        <w:jc w:val="both"/>
+      </w:pPr>
+      <w:r>
+        <w:rPr>
+          <w:rFonts w:ascii="新細明體" w:hAnsi="新細明體" w:eastAsia="新細明體"/>
+          <w:b w:val="0"/>
+          <w:sz w:val="24"/>
+        </w:rPr>
+        <w:t>說明：</w:t>
+      </w:r>
+    </w:p>
+    <w:p>
+      <w:pPr>
+        <w:pStyle w:val="a9"/>
+        <w:ind w:left="720" w:hanging="480"/>
+        <w:jc w:val="both"/>
+      </w:pPr>
+      <w:r>
+        <w:rPr>
+          <w:rFonts w:ascii="新細明體" w:hAnsi="新細明體" w:eastAsia="新細明體"/>
+          <w:b w:val="0"/>
+          <w:sz w:val="24"/>
+        </w:rPr>
         <w:t>一、依據政府採購法第97條及扶助中小企業參與政府採購辦法第4條第1項規定辦理。</w:t>
-        <w:br/>
+      </w:r>
+    </w:p>
+    <w:p>
+      <w:pPr>
+        <w:pStyle w:val="a9"/>
+        <w:ind w:left="720" w:hanging="480"/>
+        <w:jc w:val="both"/>
+      </w:pPr>
+      <w:r>
+        <w:rPr>
+          <w:rFonts w:ascii="新細明體" w:hAnsi="新細明體" w:eastAsia="新細明體"/>
+          <w:b w:val="0"/>
+          <w:sz w:val="24"/>
+        </w:rPr>
         <w:t>二、旨揭目標金額比率，業經會商各機關，並獲經濟部108年2月14日經授企字第10800526850號函同意。</w:t>
       </w:r>
     </w:p>
@@ -39705,8 +40318,21 @@
           <w:sz w:val="24"/>
         </w:rPr>
         <w:t>主旨：檢送各機關108年度之採購由中小企業承包或分包之比率統計表乙份，請查照。</w:t>
-        <w:br/>
-        <w:t>說明：依據扶助中小企業參與政府採購辦法第9條規定辦理。</w:t>
+      </w:r>
+    </w:p>
+    <w:p>
+      <w:pPr>
+        <w:pStyle w:val="a9"/>
+        <w:ind w:left="720" w:hanging="720"/>
+        <w:jc w:val="both"/>
+      </w:pPr>
+      <w:r>
+        <w:rPr>
+          <w:rFonts w:ascii="新細明體" w:hAnsi="新細明體" w:eastAsia="新細明體"/>
+          <w:b w:val="0"/>
+          <w:sz w:val="24"/>
+        </w:rPr>
+        <w:t>說明：依據扶助中小企業參與政府採購辦法第9條規定辦理。</w:t>
       </w:r>
     </w:p>
     <w:p/>
@@ -39738,11 +40364,50 @@
           <w:sz w:val="24"/>
         </w:rPr>
         <w:t>主旨：貴機關及所屬機關109年度之採購，由中小企業承包或分包之目標金額比率，維持與108年度相同之40％，請查照。</w:t>
-        <w:br/>
-        <w:t>說明：</w:t>
-        <w:br/>
+      </w:r>
+    </w:p>
+    <w:p>
+      <w:pPr>
+        <w:pStyle w:val="a9"/>
+        <w:ind w:left="720" w:hanging="720"/>
+        <w:jc w:val="both"/>
+      </w:pPr>
+      <w:r>
+        <w:rPr>
+          <w:rFonts w:ascii="新細明體" w:hAnsi="新細明體" w:eastAsia="新細明體"/>
+          <w:b w:val="0"/>
+          <w:sz w:val="24"/>
+        </w:rPr>
+        <w:t>說明：</w:t>
+      </w:r>
+    </w:p>
+    <w:p>
+      <w:pPr>
+        <w:pStyle w:val="a9"/>
+        <w:ind w:left="720" w:hanging="480"/>
+        <w:jc w:val="both"/>
+      </w:pPr>
+      <w:r>
+        <w:rPr>
+          <w:rFonts w:ascii="新細明體" w:hAnsi="新細明體" w:eastAsia="新細明體"/>
+          <w:b w:val="0"/>
+          <w:sz w:val="24"/>
+        </w:rPr>
         <w:t>一、依據政府採購法第97條及扶助中小企業參與政府採購辦法第4條第1項規定辦理。</w:t>
-        <w:br/>
+      </w:r>
+    </w:p>
+    <w:p>
+      <w:pPr>
+        <w:pStyle w:val="a9"/>
+        <w:ind w:left="720" w:hanging="480"/>
+        <w:jc w:val="both"/>
+      </w:pPr>
+      <w:r>
+        <w:rPr>
+          <w:rFonts w:ascii="新細明體" w:hAnsi="新細明體" w:eastAsia="新細明體"/>
+          <w:b w:val="0"/>
+          <w:sz w:val="24"/>
+        </w:rPr>
         <w:t>二、旨揭目標金額比率，業經會商各機關，並獲經濟部109年2月21日經授企字第10900527470號函同意。</w:t>
       </w:r>
     </w:p>
@@ -39775,8 +40440,21 @@
           <w:sz w:val="24"/>
         </w:rPr>
         <w:t>主旨：檢送各機關109年度之採購由中小企業承包或分包之金額比率統計表乙份，請查照。</w:t>
-        <w:br/>
-        <w:t>說明：依據扶助中小企業參與政府採購辦法第9條規定辦理。</w:t>
+      </w:r>
+    </w:p>
+    <w:p>
+      <w:pPr>
+        <w:pStyle w:val="a9"/>
+        <w:ind w:left="720" w:hanging="720"/>
+        <w:jc w:val="both"/>
+      </w:pPr>
+      <w:r>
+        <w:rPr>
+          <w:rFonts w:ascii="新細明體" w:hAnsi="新細明體" w:eastAsia="新細明體"/>
+          <w:b w:val="0"/>
+          <w:sz w:val="24"/>
+        </w:rPr>
+        <w:t>說明：依據扶助中小企業參與政府採購辦法第9條規定辦理。</w:t>
       </w:r>
     </w:p>
     <w:p/>
@@ -39808,11 +40486,50 @@
           <w:sz w:val="24"/>
         </w:rPr>
         <w:t>主旨：貴機關及所屬機關110年度之採購，由中小企業承包或分包之目標金額比率，調整為45％，請查照。</w:t>
-        <w:br/>
-        <w:t>說明：</w:t>
-        <w:br/>
+      </w:r>
+    </w:p>
+    <w:p>
+      <w:pPr>
+        <w:pStyle w:val="a9"/>
+        <w:ind w:left="720" w:hanging="720"/>
+        <w:jc w:val="both"/>
+      </w:pPr>
+      <w:r>
+        <w:rPr>
+          <w:rFonts w:ascii="新細明體" w:hAnsi="新細明體" w:eastAsia="新細明體"/>
+          <w:b w:val="0"/>
+          <w:sz w:val="24"/>
+        </w:rPr>
+        <w:t>說明：</w:t>
+      </w:r>
+    </w:p>
+    <w:p>
+      <w:pPr>
+        <w:pStyle w:val="a9"/>
+        <w:ind w:left="720" w:hanging="480"/>
+        <w:jc w:val="both"/>
+      </w:pPr>
+      <w:r>
+        <w:rPr>
+          <w:rFonts w:ascii="新細明體" w:hAnsi="新細明體" w:eastAsia="新細明體"/>
+          <w:b w:val="0"/>
+          <w:sz w:val="24"/>
+        </w:rPr>
         <w:t>一、依據政府採購法第97條及扶助中小企業參與政府採購辦法第4條第1項規定辦理。</w:t>
-        <w:br/>
+      </w:r>
+    </w:p>
+    <w:p>
+      <w:pPr>
+        <w:pStyle w:val="a9"/>
+        <w:ind w:left="720" w:hanging="480"/>
+        <w:jc w:val="both"/>
+      </w:pPr>
+      <w:r>
+        <w:rPr>
+          <w:rFonts w:ascii="新細明體" w:hAnsi="新細明體" w:eastAsia="新細明體"/>
+          <w:b w:val="0"/>
+          <w:sz w:val="24"/>
+        </w:rPr>
         <w:t>二、旨揭目標金額比率，業經會商各機關，並獲經濟部110年3月4日經授企字第11000542140號函同意。</w:t>
       </w:r>
     </w:p>
@@ -39921,8 +40638,21 @@
           <w:sz w:val="24"/>
         </w:rPr>
         <w:t>主旨：檢送各機關110年度之採購由中小企業承包或分包之金額比率統計表乙份，請查照。</w:t>
-        <w:br/>
-        <w:t>說明：依據扶助中小企業參與政府採購辦法第9條規定辦理。</w:t>
+      </w:r>
+    </w:p>
+    <w:p>
+      <w:pPr>
+        <w:pStyle w:val="a9"/>
+        <w:ind w:left="720" w:hanging="720"/>
+        <w:jc w:val="both"/>
+      </w:pPr>
+      <w:r>
+        <w:rPr>
+          <w:rFonts w:ascii="新細明體" w:hAnsi="新細明體" w:eastAsia="新細明體"/>
+          <w:b w:val="0"/>
+          <w:sz w:val="24"/>
+        </w:rPr>
+        <w:t>說明：依據扶助中小企業參與政府採購辦法第9條規定辦理。</w:t>
       </w:r>
     </w:p>
     <w:p/>
@@ -40076,11 +40806,50 @@
           <w:sz w:val="24"/>
         </w:rPr>
         <w:t>主旨：貴機關及所屬機關113年度之採購，由中小企業承包或分包之目標金額比率為50％，請查照。</w:t>
-        <w:br/>
-        <w:t>說明：</w:t>
-        <w:br/>
+      </w:r>
+    </w:p>
+    <w:p>
+      <w:pPr>
+        <w:pStyle w:val="a9"/>
+        <w:ind w:left="720" w:hanging="720"/>
+        <w:jc w:val="both"/>
+      </w:pPr>
+      <w:r>
+        <w:rPr>
+          <w:rFonts w:ascii="新細明體" w:hAnsi="新細明體" w:eastAsia="新細明體"/>
+          <w:b w:val="0"/>
+          <w:sz w:val="24"/>
+        </w:rPr>
+        <w:t>說明：</w:t>
+      </w:r>
+    </w:p>
+    <w:p>
+      <w:pPr>
+        <w:pStyle w:val="a9"/>
+        <w:ind w:left="720" w:hanging="480"/>
+        <w:jc w:val="both"/>
+      </w:pPr>
+      <w:r>
+        <w:rPr>
+          <w:rFonts w:ascii="新細明體" w:hAnsi="新細明體" w:eastAsia="新細明體"/>
+          <w:b w:val="0"/>
+          <w:sz w:val="24"/>
+        </w:rPr>
         <w:t>一、依據政府採購法第97條及扶助中小企業參與政府採購辦法第4條第1項規定辦理。</w:t>
-        <w:br/>
+      </w:r>
+    </w:p>
+    <w:p>
+      <w:pPr>
+        <w:pStyle w:val="a9"/>
+        <w:ind w:left="720" w:hanging="480"/>
+        <w:jc w:val="both"/>
+      </w:pPr>
+      <w:r>
+        <w:rPr>
+          <w:rFonts w:ascii="新細明體" w:hAnsi="新細明體" w:eastAsia="新細明體"/>
+          <w:b w:val="0"/>
+          <w:sz w:val="24"/>
+        </w:rPr>
         <w:t>二、旨揭目標金額比率，業經會商各機關，並獲經濟部113年3月21日經授企字第11300560520號函同意。</w:t>
       </w:r>
     </w:p>
@@ -40573,37 +41342,245 @@
           <w:sz w:val="24"/>
         </w:rPr>
         <w:t>主旨：檢送「河道搶險搶通復舊及有價土石處理原則」乙份，請查照並轉知所屬（轄）機關。</w:t>
-        <w:br/>
-        <w:t>河道搶險搶通復舊及有價土石處理原則</w:t>
-        <w:br/>
+      </w:r>
+    </w:p>
+    <w:p>
+      <w:pPr>
+        <w:pStyle w:val="a9"/>
+        <w:ind w:left="720" w:hanging="720"/>
+        <w:jc w:val="both"/>
+      </w:pPr>
+      <w:r>
+        <w:rPr>
+          <w:rFonts w:ascii="新細明體" w:hAnsi="新細明體" w:eastAsia="新細明體"/>
+          <w:b w:val="0"/>
+          <w:sz w:val="24"/>
+        </w:rPr>
+        <w:t>說明：河道搶險搶通復舊及有價土石處理原則</w:t>
+      </w:r>
+    </w:p>
+    <w:p>
+      <w:pPr>
+        <w:pStyle w:val="a9"/>
+        <w:ind w:left="720" w:hanging="480"/>
+        <w:jc w:val="both"/>
+      </w:pPr>
+      <w:r>
+        <w:rPr>
+          <w:rFonts w:ascii="新細明體" w:hAnsi="新細明體" w:eastAsia="新細明體"/>
+          <w:b w:val="0"/>
+          <w:sz w:val="24"/>
+        </w:rPr>
         <w:t>一、為利機關辦理河道搶險、搶通、復舊與後續作業及處理所產生之土石，並釐清相關權責，特訂定本處理原則。</w:t>
-        <w:br/>
+      </w:r>
+    </w:p>
+    <w:p>
+      <w:pPr>
+        <w:pStyle w:val="a9"/>
+        <w:ind w:left="720" w:hanging="480"/>
+        <w:jc w:val="both"/>
+      </w:pPr>
+      <w:r>
+        <w:rPr>
+          <w:rFonts w:ascii="新細明體" w:hAnsi="新細明體" w:eastAsia="新細明體"/>
+          <w:b w:val="0"/>
+          <w:sz w:val="24"/>
+        </w:rPr>
         <w:t>二、河道之搶險或搶通辦理機關及其權責如下：</w:t>
-        <w:br/>
+      </w:r>
+    </w:p>
+    <w:p>
+      <w:pPr>
+        <w:pStyle w:val="a9"/>
+        <w:ind w:left="964" w:hanging="680"/>
+        <w:jc w:val="both"/>
+      </w:pPr>
+      <w:r>
+        <w:rPr>
+          <w:rFonts w:ascii="新細明體" w:hAnsi="新細明體" w:eastAsia="新細明體"/>
+          <w:b w:val="0"/>
+          <w:sz w:val="24"/>
+        </w:rPr>
         <w:t>（一）位於中央管河川且屬河川管理機關與水土保持法主管機關訂定治理界點(以下簡稱治理界點)下游，或位於縣(市)管河川且非屬水土保持、林業經營範圍者，依河川管理辦法第四條第一項規定，由縣(市)政府辦理。</w:t>
-        <w:br/>
+      </w:r>
+    </w:p>
+    <w:p>
+      <w:pPr>
+        <w:pStyle w:val="a9"/>
+        <w:ind w:left="964" w:hanging="680"/>
+        <w:jc w:val="both"/>
+      </w:pPr>
+      <w:r>
+        <w:rPr>
+          <w:rFonts w:ascii="新細明體" w:hAnsi="新細明體" w:eastAsia="新細明體"/>
+          <w:b w:val="0"/>
+          <w:sz w:val="24"/>
+        </w:rPr>
         <w:t>（二）位於中央管河川且屬治理界點上游，或位於縣(市)管河川之水土保持、林業經營範圍者，於土石流災害發生或有發生之虞時，應由地方政府於第一時間即時辦理；如災害受創嚴重而無法因應處理，得向行政院農業委員會提出支援請求，由該會依「行政院農業委員會支援地方政府因應土石流災害處理協助項目及程序規定」辦理，或由該會主動派員協助。搶險、搶通工作完成後所產生之堆置土石，由縣(市)政府儘速處理。</w:t>
-        <w:br/>
+      </w:r>
+    </w:p>
+    <w:p>
+      <w:pPr>
+        <w:pStyle w:val="a9"/>
+        <w:ind w:left="720" w:hanging="480"/>
+        <w:jc w:val="both"/>
+      </w:pPr>
+      <w:r>
+        <w:rPr>
+          <w:rFonts w:ascii="新細明體" w:hAnsi="新細明體" w:eastAsia="新細明體"/>
+          <w:b w:val="0"/>
+          <w:sz w:val="24"/>
+        </w:rPr>
         <w:t>三、河道復舊及後續作業辦理機關及其權責如下：</w:t>
-        <w:br/>
+      </w:r>
+    </w:p>
+    <w:p>
+      <w:pPr>
+        <w:pStyle w:val="a9"/>
+        <w:ind w:left="964" w:hanging="680"/>
+        <w:jc w:val="both"/>
+      </w:pPr>
+      <w:r>
+        <w:rPr>
+          <w:rFonts w:ascii="新細明體" w:hAnsi="新細明體" w:eastAsia="新細明體"/>
+          <w:b w:val="0"/>
+          <w:sz w:val="24"/>
+        </w:rPr>
         <w:t>（一）位於中央管河川之治理界點下游，或位於縣(市)管河川且非屬水土保持、林業經營範圍者，應由河川管理機關本於權責辦理疏濬清除淤積土石，以增加排洪斷面，避免影響河川安全。</w:t>
-        <w:br/>
+      </w:r>
+    </w:p>
+    <w:p>
+      <w:pPr>
+        <w:pStyle w:val="a9"/>
+        <w:ind w:left="964" w:hanging="680"/>
+        <w:jc w:val="both"/>
+      </w:pPr>
+      <w:r>
+        <w:rPr>
+          <w:rFonts w:ascii="新細明體" w:hAnsi="新細明體" w:eastAsia="新細明體"/>
+          <w:b w:val="0"/>
+          <w:sz w:val="24"/>
+        </w:rPr>
         <w:t>（二）位於中央管河川且屬治理界點上游，或位於縣(市)管河川之水土保持、林業經營範圍者，分別由水土保持法、森林法之主管機關辦理水土保持或治山防災工作。</w:t>
-        <w:br/>
+      </w:r>
+    </w:p>
+    <w:p>
+      <w:pPr>
+        <w:pStyle w:val="a9"/>
+        <w:ind w:left="720" w:hanging="480"/>
+        <w:jc w:val="both"/>
+      </w:pPr>
+      <w:r>
+        <w:rPr>
+          <w:rFonts w:ascii="新細明體" w:hAnsi="新細明體" w:eastAsia="新細明體"/>
+          <w:b w:val="0"/>
+          <w:sz w:val="24"/>
+        </w:rPr>
         <w:t>四、行政院農業委員會水土保持局及林務局依第二點第(二)款辦理而需核付費用予鄉(鎮、市、區)公所者，於辦理相關會勘時，應同時邀請該會勘地點所在地之縣(市)政府派員參加。</w:t>
-        <w:br/>
+      </w:r>
+    </w:p>
+    <w:p>
+      <w:pPr>
+        <w:pStyle w:val="a9"/>
+        <w:ind w:left="720" w:hanging="480"/>
+        <w:jc w:val="both"/>
+      </w:pPr>
+      <w:r>
+        <w:rPr>
+          <w:rFonts w:ascii="新細明體" w:hAnsi="新細明體" w:eastAsia="新細明體"/>
+          <w:b w:val="0"/>
+          <w:sz w:val="24"/>
+        </w:rPr>
         <w:t>五、中央管河川治理界點下游之搶險，縣(市)政府或鄉(鎮、市、區)公所要求中央協助者，經濟部水利署得依地方政府之申請核給補助經費，或視實際需要逕予處理。</w:t>
-        <w:br/>
+      </w:r>
+    </w:p>
+    <w:p>
+      <w:pPr>
+        <w:pStyle w:val="a9"/>
+        <w:ind w:left="720" w:hanging="480"/>
+        <w:jc w:val="both"/>
+      </w:pPr>
+      <w:r>
+        <w:rPr>
+          <w:rFonts w:ascii="新細明體" w:hAnsi="新細明體" w:eastAsia="新細明體"/>
+          <w:b w:val="0"/>
+          <w:sz w:val="24"/>
+        </w:rPr>
         <w:t>六、機關辦理河道搶險、搶通、復舊與後續處理所產生土石之處理方式如下：</w:t>
-        <w:br/>
+      </w:r>
+    </w:p>
+    <w:p>
+      <w:pPr>
+        <w:pStyle w:val="a9"/>
+        <w:ind w:left="964" w:hanging="680"/>
+        <w:jc w:val="both"/>
+      </w:pPr>
+      <w:r>
+        <w:rPr>
+          <w:rFonts w:ascii="新細明體" w:hAnsi="新細明體" w:eastAsia="新細明體"/>
+          <w:b w:val="0"/>
+          <w:sz w:val="24"/>
+        </w:rPr>
         <w:t>（一）為爭取處理時效而需依政府採購法第一百零五條規定緊急處置者，以工程採購與有價土石標售分開辦理為原則。</w:t>
-        <w:br/>
+      </w:r>
+    </w:p>
+    <w:p>
+      <w:pPr>
+        <w:pStyle w:val="a9"/>
+        <w:ind w:left="964" w:hanging="680"/>
+        <w:jc w:val="both"/>
+      </w:pPr>
+      <w:r>
+        <w:rPr>
+          <w:rFonts w:ascii="新細明體" w:hAnsi="新細明體" w:eastAsia="新細明體"/>
+          <w:b w:val="0"/>
+          <w:sz w:val="24"/>
+        </w:rPr>
         <w:t>（二）將工程採購與有價土石標售以合併招標方式辦理者，應區分工程支出及有價土石標售收入，並分別編列預算書；採購金額之計算應依政府採購法施行細則第六條第九款規定認定；決標原則得採用收入與支出之差值對機關最佳者辦理。</w:t>
-        <w:br/>
+      </w:r>
+    </w:p>
+    <w:p>
+      <w:pPr>
+        <w:pStyle w:val="a9"/>
+        <w:ind w:left="964" w:hanging="680"/>
+        <w:jc w:val="both"/>
+      </w:pPr>
+      <w:r>
+        <w:rPr>
+          <w:rFonts w:ascii="新細明體" w:hAnsi="新細明體" w:eastAsia="新細明體"/>
+          <w:b w:val="0"/>
+          <w:sz w:val="24"/>
+        </w:rPr>
         <w:t>（三）機關就有價土石標售之收入，應依預算法相關規定辦理繳庫，不得扣抵、挪移或墊用。</w:t>
-        <w:br/>
+      </w:r>
+    </w:p>
+    <w:p>
+      <w:pPr>
+        <w:pStyle w:val="a9"/>
+        <w:ind w:left="964" w:hanging="680"/>
+        <w:jc w:val="both"/>
+      </w:pPr>
+      <w:r>
+        <w:rPr>
+          <w:rFonts w:ascii="新細明體" w:hAnsi="新細明體" w:eastAsia="新細明體"/>
+          <w:b w:val="0"/>
+          <w:sz w:val="24"/>
+        </w:rPr>
         <w:t>（四）工程主辦機關對於辦理河道搶險、搶通、復舊與後續處理所產生之土石，如需堆置者，應依相關規定覓妥適當堆置場地，不得影響排洪。各地方政府於平時即應覓妥適當堆置場地，避免臨時無處堆置。</w:t>
-        <w:br/>
+      </w:r>
+    </w:p>
+    <w:p>
+      <w:pPr>
+        <w:pStyle w:val="a9"/>
+        <w:ind w:left="720" w:hanging="480"/>
+        <w:jc w:val="both"/>
+      </w:pPr>
+      <w:r>
+        <w:rPr>
+          <w:rFonts w:ascii="新細明體" w:hAnsi="新細明體" w:eastAsia="新細明體"/>
+          <w:b w:val="0"/>
+          <w:sz w:val="24"/>
+        </w:rPr>
         <w:t>七、河道淤積土石無立即安全影響者，得由河川管理機關依河川管理辦法第四十一條及「經濟部水利署辦理中央管河川土石可採區規劃公告及管理作業要點」相關規定，規劃公告可採區後，依土石採取法及河川管理辦法等相關規定，受理民眾申請許可採取土石。</w:t>
       </w:r>
     </w:p>
@@ -40695,7 +41672,7 @@
           <w:b w:val="0"/>
           <w:sz w:val="24"/>
         </w:rPr>
-        <w:t>1.公共工程各標案應先力求土石方之自我平衡，復就不足部分檢討同一計畫內標案間土石方之相互平衡；如經客觀檢討仍無法達成平衡，則應掌握其他公共工程（含尚未施工之公共工程）之土石方供需資訊，以規劃可行之棄土、借土專區。</w:t>
+        <w:t>1、公共工程各標案應先力求土石方之自我平衡，復就不足部分檢討同一計畫內標案間土石方之相互平衡；如經客觀檢討仍無法達成平衡，則應掌握其他公共工程（含尚未施工之公共工程）之土石方供需資訊，以規劃可行之棄土、借土專區。</w:t>
       </w:r>
     </w:p>
     <w:p>
@@ -40710,7 +41687,7 @@
           <w:b w:val="0"/>
           <w:sz w:val="24"/>
         </w:rPr>
-        <w:t>2.請依本會95年5月9日工程管字第09500171110號函（如附件）於審議通過後，依「公共工程及公有建築工程營建剩餘土石方交換利用作業要點」上網申報土石方交換資訊。</w:t>
+        <w:t>2、請依本會95年5月9日工程管字第09500171110號函（如附件）於審議通過後，依「公共工程及公有建築工程營建剩餘土石方交換利用作業要點」上網申報土石方交換資訊。</w:t>
       </w:r>
     </w:p>
     <w:p>
@@ -40740,7 +41717,7 @@
           <w:b w:val="0"/>
           <w:sz w:val="24"/>
         </w:rPr>
-        <w:t>1.公共工程土石方如經妥善規劃仍無法達成平衡，施工期間應依內政部營建署公共工程土石方交換機制作業，於減省政府整體支出經費、促進營建資源有效利用、不增加對交通環境影響之三項前提下，積極尋求與其他公共工程交換之機會，並請內政部營建署主動積極協調媒合。</w:t>
+        <w:t>1、公共工程土石方如經妥善規劃仍無法達成平衡，施工期間應依內政部營建署公共工程土石方交換機制作業，於減省政府整體支出經費、促進營建資源有效利用、不增加對交通環境影響之三項前提下，積極尋求與其他公共工程交換之機會，並請內政部營建署主動積極協調媒合。</w:t>
       </w:r>
     </w:p>
     <w:p>
@@ -40755,7 +41732,7 @@
           <w:b w:val="0"/>
           <w:sz w:val="24"/>
         </w:rPr>
-        <w:t>2.經內政部營建署政策評估結果認定可減省政府整體支出經費、促進營建資源有效利用、不增加對交通環境影響者，本會同意認定符合政府採購法第64條規定之「公共利益」原則，被協調機關得據以報經上級機關核准後終止與剩餘土石方處理、清運有關之部分契約。</w:t>
+        <w:t>2、經內政部營建署政策評估結果認定可減省政府整體支出經費、促進營建資源有效利用、不增加對交通環境影響者，本會同意認定符合政府採購法第64條規定之「公共利益」原則，被協調機關得據以報經上級機關核准後終止與剩餘土石方處理、清運有關之部分契約。</w:t>
       </w:r>
     </w:p>
     <w:p>
@@ -40856,27 +41833,27 @@
         <w:br/>
         <w:t>（一）嘉義縣政府辦理之污水下水道工程：</w:t>
         <w:br/>
-        <w:t>1.污水處理廠新建工程，既已另案委託廠商辦理細部設計，非屬將設計與施工併同辦理採購之統包方式，即規劃設計已完成，本件無統包問題；且將來得標廠商施工時，施工圖說及規範明確，按圖施工即可，以最低標決標方式辦理應無困難，應採最低標方式辦理。</w:t>
+        <w:t>1、污水處理廠新建工程，既已另案委託廠商辦理細部設計，非屬將設計與施工併同辦理採購之統包方式，即規劃設計已完成，本件無統包問題；且將來得標廠商施工時，施工圖說及規範明確，按圖施工即可，以最低標決標方式辦理應無困難，應採最低標方式辦理。</w:t>
         <w:br/>
-        <w:t>2.將污水處理廠新建工程、管線工程及用戶接管工程合併辦理採購，因涉及不同專業廠商且標案金額過大，另仍須解決廠商間之施工界面問題，其是否能較分別辦理採購更有效率尚非無疑，建議嘉義縣政府審慎衡酌。</w:t>
+        <w:t>2、將污水處理廠新建工程、管線工程及用戶接管工程合併辦理採購，因涉及不同專業廠商且標案金額過大，另仍須解決廠商間之施工界面問題，其是否能較分別辦理採購更有效率尚非無疑，建議嘉義縣政府審慎衡酌。</w:t>
         <w:br/>
         <w:t>（二）污水處理廠新建工程、管線工程及用戶接管工程有無合併辦理採購之必要，應審酌下列情形就個案研判：</w:t>
         <w:br/>
-        <w:t>1.業界慣例(以符合專業廠商之執行能力)。</w:t>
+        <w:t>1、業界慣例(以符合專業廠商之執行能力)。</w:t>
         <w:br/>
-        <w:t>2.標案規模(市場接受程度及市場競爭情形)。</w:t>
+        <w:t>2、標案規模(市場接受程度及市場競爭情形)。</w:t>
         <w:br/>
-        <w:t>3.不同專業廠商間之整合能力。</w:t>
+        <w:t>3、不同專業廠商間之整合能力。</w:t>
         <w:br/>
-        <w:t>4.各系統建置期程間之配合。</w:t>
+        <w:t>4、各系統建置期程間之配合。</w:t>
         <w:br/>
         <w:t>（三）就各地方政府執行經驗而言：</w:t>
         <w:br/>
-        <w:t>1.污水處理廠新建工程單獨興建應無問題。</w:t>
+        <w:t>1、污水處理廠新建工程單獨興建應無問題。</w:t>
         <w:br/>
-        <w:t>2.管線工程部分應考量擴大其規模，以達經濟效益並降低總體價格。</w:t>
+        <w:t>2、管線工程部分應考量擴大其規模，以達經濟效益並降低總體價格。</w:t>
         <w:br/>
-        <w:t>3.至於用戶接管工程，應待污水處理廠新建工程及管線工程興建期程確定後，再為分標策略之規劃為宜。</w:t>
+        <w:t>3、至於用戶接管工程，應待污水處理廠新建工程及管線工程興建期程確定後，再為分標策略之規劃為宜。</w:t>
         <w:br/>
         <w:t>（四）上述污水處理廠新建工程、管線工程及用戶接管工程，經徵詢各地方政府之執行經驗，採最低標決標方式並無執行困難。</w:t>
         <w:br/>
@@ -42874,33 +43851,215 @@
           <w:sz w:val="24"/>
         </w:rPr>
         <w:t>主旨：為解決砂石及預拌混凝土供需遭遇問題及價格不合理上漲，以利公共工程順利推動，政府三管齊下，由源頭掌握料源供需，並查緝囤積、聯合哄抬不法行為，機關於必要時得採自行購料等採購策略因應措施，請查照並轉知所屬機關。</w:t>
-        <w:br/>
-        <w:t>說明：</w:t>
-        <w:br/>
+      </w:r>
+    </w:p>
+    <w:p>
+      <w:pPr>
+        <w:pStyle w:val="a9"/>
+        <w:ind w:left="720" w:hanging="720"/>
+        <w:jc w:val="both"/>
+      </w:pPr>
+      <w:r>
+        <w:rPr>
+          <w:rFonts w:ascii="新細明體" w:hAnsi="新細明體" w:eastAsia="新細明體"/>
+          <w:b w:val="0"/>
+          <w:sz w:val="24"/>
+        </w:rPr>
+        <w:t>說明：</w:t>
+      </w:r>
+    </w:p>
+    <w:p>
+      <w:pPr>
+        <w:pStyle w:val="a9"/>
+        <w:ind w:left="720" w:hanging="480"/>
+        <w:jc w:val="both"/>
+      </w:pPr>
+      <w:r>
+        <w:rPr>
+          <w:rFonts w:ascii="新細明體" w:hAnsi="新細明體" w:eastAsia="新細明體"/>
+          <w:b w:val="0"/>
+          <w:sz w:val="24"/>
+        </w:rPr>
         <w:t>一、依行政院108年3月15日召開「研商砂石相關事宜」會議及本會108年3月22日召開「預防砂石及預拌混凝土供需遭遇問題及價格不合理上漲之採購策略因應措施」會議結論辦理。</w:t>
-        <w:br/>
+      </w:r>
+    </w:p>
+    <w:p>
+      <w:pPr>
+        <w:pStyle w:val="a9"/>
+        <w:ind w:left="720" w:hanging="480"/>
+        <w:jc w:val="both"/>
+      </w:pPr>
+      <w:r>
+        <w:rPr>
+          <w:rFonts w:ascii="新細明體" w:hAnsi="新細明體" w:eastAsia="新細明體"/>
+          <w:b w:val="0"/>
+          <w:sz w:val="24"/>
+        </w:rPr>
         <w:t>二、目前砂石料源已可穩定供應，惟為預防砂石及預拌混凝土不合理漲價，機關於必要時得採行之採購策略因應措施，說明如下：</w:t>
-        <w:br/>
+      </w:r>
+    </w:p>
+    <w:p>
+      <w:pPr>
+        <w:pStyle w:val="a9"/>
+        <w:ind w:left="964" w:hanging="680"/>
+        <w:jc w:val="both"/>
+      </w:pPr>
+      <w:r>
+        <w:rPr>
+          <w:rFonts w:ascii="新細明體" w:hAnsi="新細明體" w:eastAsia="新細明體"/>
+          <w:b w:val="0"/>
+          <w:sz w:val="24"/>
+        </w:rPr>
         <w:t>（一）尚未招標或重行招標之工程採購案：機關得改變公共工程採購策略，採工料分別招標作業模式由機關自行購料，提供施工廠商施作。</w:t>
-        <w:br/>
+      </w:r>
+    </w:p>
+    <w:p>
+      <w:pPr>
+        <w:pStyle w:val="a9"/>
+        <w:ind w:left="1225" w:hanging="397"/>
+        <w:jc w:val="both"/>
+      </w:pPr>
+      <w:r>
+        <w:rPr>
+          <w:rFonts w:ascii="新細明體" w:hAnsi="新細明體" w:eastAsia="新細明體"/>
+          <w:b w:val="0"/>
+          <w:sz w:val="24"/>
+        </w:rPr>
         <w:t>１、工程採購案招標文件載明砂石及預拌混凝土由機關供應，不列入計價項目。</w:t>
-        <w:br/>
+      </w:r>
+    </w:p>
+    <w:p>
+      <w:pPr>
+        <w:pStyle w:val="a9"/>
+        <w:ind w:left="1225" w:hanging="397"/>
+        <w:jc w:val="both"/>
+      </w:pPr>
+      <w:r>
+        <w:rPr>
+          <w:rFonts w:ascii="新細明體" w:hAnsi="新細明體" w:eastAsia="新細明體"/>
+          <w:b w:val="0"/>
+          <w:sz w:val="24"/>
+        </w:rPr>
         <w:t>２、經濟部水利署訂定之「河川水庫疏濬採售分離土石申購作業規定」第3點第1款規定：「專案申購：指將河川疏濬土石販售總量，保留一定比例，優先提供重大公共工程主辦機關申購使用......」，機關如有採購需求，可向該署提出專案申購，提供工程施工廠商使用。政府採購法第105條第1項第3款公務機關間財物之取得規定，併請查察。</w:t>
-        <w:br/>
+      </w:r>
+    </w:p>
+    <w:p>
+      <w:pPr>
+        <w:pStyle w:val="a9"/>
+        <w:ind w:left="1225" w:hanging="397"/>
+        <w:jc w:val="both"/>
+      </w:pPr>
+      <w:r>
+        <w:rPr>
+          <w:rFonts w:ascii="新細明體" w:hAnsi="新細明體" w:eastAsia="新細明體"/>
+          <w:b w:val="0"/>
+          <w:sz w:val="24"/>
+        </w:rPr>
         <w:t>３、由機關自行辦理預拌混凝土採購，提供施工廠商使用。</w:t>
-        <w:br/>
+      </w:r>
+    </w:p>
+    <w:p>
+      <w:pPr>
+        <w:pStyle w:val="a9"/>
+        <w:ind w:left="1225" w:hanging="397"/>
+        <w:jc w:val="both"/>
+      </w:pPr>
+      <w:r>
+        <w:rPr>
+          <w:rFonts w:ascii="新細明體" w:hAnsi="新細明體" w:eastAsia="新細明體"/>
+          <w:b w:val="0"/>
+          <w:sz w:val="24"/>
+        </w:rPr>
         <w:t>４、為方便各機關購料，機關得整合共通需求辦理集中採購或簽訂預拌混凝土共同供應契約，採公開招標，複數決標，由訂購機關自行選擇預拌混凝土供應廠商，依契約提供予各工程施工廠商使用。</w:t>
-        <w:br/>
+      </w:r>
+    </w:p>
+    <w:p>
+      <w:pPr>
+        <w:pStyle w:val="a9"/>
+        <w:ind w:left="1225" w:hanging="397"/>
+        <w:jc w:val="both"/>
+      </w:pPr>
+      <w:r>
+        <w:rPr>
+          <w:rFonts w:ascii="新細明體" w:hAnsi="新細明體" w:eastAsia="新細明體"/>
+          <w:b w:val="0"/>
+          <w:sz w:val="24"/>
+        </w:rPr>
         <w:t>５、為確保預拌混凝土品質，機關於契約訂明預拌混凝土規範，並於履約過程中辦理分段查驗或駐廠監督依約履行，由機關(含發料單位)或監造單位會同立約商辦理抽驗，送交符合CNS 17025規定之實驗室辦理檢驗，並出具檢驗報告。</w:t>
-        <w:br/>
+      </w:r>
+    </w:p>
+    <w:p>
+      <w:pPr>
+        <w:pStyle w:val="a9"/>
+        <w:ind w:left="964" w:hanging="680"/>
+        <w:jc w:val="both"/>
+      </w:pPr>
+      <w:r>
+        <w:rPr>
+          <w:rFonts w:ascii="新細明體" w:hAnsi="新細明體" w:eastAsia="新細明體"/>
+          <w:b w:val="0"/>
+          <w:sz w:val="24"/>
+        </w:rPr>
         <w:t>（二）在建工程採購案：</w:t>
-        <w:br/>
+      </w:r>
+    </w:p>
+    <w:p>
+      <w:pPr>
+        <w:pStyle w:val="a9"/>
+        <w:ind w:left="1225" w:hanging="397"/>
+        <w:jc w:val="both"/>
+      </w:pPr>
+      <w:r>
+        <w:rPr>
+          <w:rFonts w:ascii="新細明體" w:hAnsi="新細明體" w:eastAsia="新細明體"/>
+          <w:b w:val="0"/>
+          <w:sz w:val="24"/>
+        </w:rPr>
         <w:t>１、廠商履約中如有因砂石及預拌混凝土漲價影響而無法施作之情形，機關得與廠商合意辦理契約變更，改由機關採購砂石及預拌混凝土供應廠商施作。具體作法同二(一)。</w:t>
-        <w:br/>
+      </w:r>
+    </w:p>
+    <w:p>
+      <w:pPr>
+        <w:pStyle w:val="a9"/>
+        <w:ind w:left="1225" w:hanging="397"/>
+        <w:jc w:val="both"/>
+      </w:pPr>
+      <w:r>
+        <w:rPr>
+          <w:rFonts w:ascii="新細明體" w:hAnsi="新細明體" w:eastAsia="新細明體"/>
+          <w:b w:val="0"/>
+          <w:sz w:val="24"/>
+        </w:rPr>
         <w:t>２、各機關履約中之政府採購案件，因不可抗力或不可歸責於契約當事人之事由，致廠商未能依契約所定期限履行者，得依個案契約約定及廠商申請之事實及理由，辦理延長履約期限相關事宜。本會108年1月22日工程企字第1080100081號函，併請查察。</w:t>
-        <w:br/>
+      </w:r>
+    </w:p>
+    <w:p>
+      <w:pPr>
+        <w:pStyle w:val="a9"/>
+        <w:ind w:left="964" w:hanging="680"/>
+        <w:jc w:val="both"/>
+      </w:pPr>
+      <w:r>
+        <w:rPr>
+          <w:rFonts w:ascii="新細明體" w:hAnsi="新細明體" w:eastAsia="新細明體"/>
+          <w:b w:val="0"/>
+          <w:sz w:val="24"/>
+        </w:rPr>
         <w:t>（三）允許廠商於公共工程工地設置工地型預拌混凝土設備：查「公共工程工地型預拌混凝土設備設置及拆除管理要點」第3點第2項，機關除符合工地附近二十公里運距內無足夠合法預拌混凝土廠或其產品無法滿足工程之需求外，不得允許廠商於公共工程工地設置工地型預拌混凝土設備。故如砂石短缺致混凝土廠無法供應材料，屬後段其產品無法滿足工程需要，可依規定設置工地型預拌混凝土設備。機關可視個案實際情形，依契約約定及該條規定辦理。</w:t>
-        <w:br/>
+      </w:r>
+    </w:p>
+    <w:p>
+      <w:pPr>
+        <w:pStyle w:val="a9"/>
+        <w:ind w:left="720" w:hanging="480"/>
+        <w:jc w:val="both"/>
+      </w:pPr>
+      <w:r>
+        <w:rPr>
+          <w:rFonts w:ascii="新細明體" w:hAnsi="新細明體" w:eastAsia="新細明體"/>
+          <w:b w:val="0"/>
+          <w:sz w:val="24"/>
+        </w:rPr>
         <w:t>三、另砂石屬營建工程之重要料源，為減省砂石新料使用，工程主辦機關於辦理道路刨舖等工程規劃設計時，應要求設計單位以「刨用平衡」為原則辦理設計(本工程或跨工程間)。如仍有賸餘挖（刨）除料，應依個案特性妥適規劃其去處，並確實訪價釐清市場行情後，合理編列折價或處理費。本會107年2月6日工程技字第10700039540號函，併請查察（上述本會函均公開於本會網站）。</w:t>
       </w:r>
     </w:p>

</xml_diff>